<commit_message>
SDS - Practicals & Output
</commit_message>
<xml_diff>
--- a/SEMESTER - 7/Software Development Security/DOCX FILE/SDS PRACTICAL 1.docx
+++ b/SEMESTER - 7/Software Development Security/DOCX FILE/SDS PRACTICAL 1.docx
@@ -13,6 +13,7 @@
         <w:rPr>
           <w:rFonts w:ascii="Times New Roman" w:cs="Times New Roman" w:eastAsia="Times New Roman" w:hAnsi="Times New Roman"/>
           <w:b w:val="1"/>
+          <w:bCs w:val="1"/>
           <w:sz w:val="32"/>
           <w:szCs w:val="32"/>
         </w:rPr>
@@ -21,6 +22,7 @@
         <w:rPr>
           <w:rFonts w:ascii="Times New Roman" w:cs="Times New Roman" w:eastAsia="Times New Roman" w:hAnsi="Times New Roman"/>
           <w:b w:val="1"/>
+          <w:bCs w:val="1"/>
           <w:sz w:val="32"/>
           <w:szCs w:val="32"/>
           <w:rtl w:val="0"/>
@@ -45,6 +47,7 @@
         <w:rPr>
           <w:rFonts w:ascii="Times New Roman" w:cs="Times New Roman" w:eastAsia="Times New Roman" w:hAnsi="Times New Roman"/>
           <w:b w:val="1"/>
+          <w:bCs w:val="1"/>
           <w:sz w:val="28"/>
           <w:szCs w:val="28"/>
           <w:rtl w:val="0"/>
@@ -76,6 +79,7 @@
         <w:rPr>
           <w:rFonts w:ascii="Times New Roman" w:cs="Times New Roman" w:eastAsia="Times New Roman" w:hAnsi="Times New Roman"/>
           <w:b w:val="1"/>
+          <w:bCs w:val="1"/>
           <w:sz w:val="28"/>
           <w:szCs w:val="28"/>
         </w:rPr>
@@ -84,6 +88,7 @@
         <w:rPr>
           <w:rFonts w:ascii="Times New Roman" w:cs="Times New Roman" w:eastAsia="Times New Roman" w:hAnsi="Times New Roman"/>
           <w:b w:val="1"/>
+          <w:bCs w:val="1"/>
           <w:sz w:val="28"/>
           <w:szCs w:val="28"/>
           <w:rtl w:val="0"/>
@@ -101,6 +106,7 @@
         <w:rPr>
           <w:rFonts w:ascii="Times New Roman" w:cs="Times New Roman" w:eastAsia="Times New Roman" w:hAnsi="Times New Roman"/>
           <w:b w:val="1"/>
+          <w:bCs w:val="1"/>
           <w:sz w:val="28"/>
           <w:szCs w:val="28"/>
         </w:rPr>
@@ -109,6 +115,7 @@
         <w:rPr>
           <w:rFonts w:ascii="Times New Roman" w:cs="Times New Roman" w:eastAsia="Times New Roman" w:hAnsi="Times New Roman"/>
           <w:b w:val="1"/>
+          <w:bCs w:val="1"/>
           <w:sz w:val="28"/>
           <w:szCs w:val="28"/>
           <w:rtl w:val="0"/>
@@ -133,6 +140,7 @@
         <w:rPr>
           <w:rFonts w:ascii="Times New Roman" w:cs="Times New Roman" w:eastAsia="Times New Roman" w:hAnsi="Times New Roman"/>
           <w:b w:val="1"/>
+          <w:bCs w:val="1"/>
           <w:sz w:val="24"/>
           <w:szCs w:val="24"/>
           <w:rtl w:val="0"/>
@@ -152,6 +160,7 @@
         <w:rPr>
           <w:rFonts w:ascii="Times New Roman" w:cs="Times New Roman" w:eastAsia="Times New Roman" w:hAnsi="Times New Roman"/>
           <w:b w:val="1"/>
+          <w:bCs w:val="1"/>
           <w:sz w:val="24"/>
           <w:szCs w:val="24"/>
           <w:rtl w:val="0"/>
@@ -183,6 +192,7 @@
         <w:rPr>
           <w:rFonts w:ascii="Times New Roman" w:cs="Times New Roman" w:eastAsia="Times New Roman" w:hAnsi="Times New Roman"/>
           <w:b w:val="1"/>
+          <w:bCs w:val="1"/>
           <w:sz w:val="28"/>
           <w:szCs w:val="28"/>
         </w:rPr>
@@ -191,6 +201,7 @@
         <w:rPr>
           <w:rFonts w:ascii="Times New Roman" w:cs="Times New Roman" w:eastAsia="Times New Roman" w:hAnsi="Times New Roman"/>
           <w:b w:val="1"/>
+          <w:bCs w:val="1"/>
           <w:sz w:val="28"/>
           <w:szCs w:val="28"/>
           <w:rtl w:val="0"/>
@@ -209,6 +220,7 @@
         <w:rPr>
           <w:rFonts w:ascii="Times New Roman" w:cs="Times New Roman" w:eastAsia="Times New Roman" w:hAnsi="Times New Roman"/>
           <w:b w:val="1"/>
+          <w:bCs w:val="1"/>
           <w:sz w:val="28"/>
           <w:szCs w:val="28"/>
         </w:rPr>
@@ -217,6 +229,7 @@
         <w:rPr>
           <w:rFonts w:ascii="Times New Roman" w:cs="Times New Roman" w:eastAsia="Times New Roman" w:hAnsi="Times New Roman"/>
           <w:b w:val="1"/>
+          <w:bCs w:val="1"/>
           <w:sz w:val="28"/>
           <w:szCs w:val="28"/>
           <w:rtl w:val="0"/>
@@ -264,6 +277,7 @@
         <w:rPr>
           <w:rFonts w:ascii="Times New Roman" w:cs="Times New Roman" w:eastAsia="Times New Roman" w:hAnsi="Times New Roman"/>
           <w:b w:val="1"/>
+          <w:bCs w:val="1"/>
           <w:sz w:val="24"/>
           <w:szCs w:val="24"/>
         </w:rPr>
@@ -272,6 +286,7 @@
         <w:rPr>
           <w:rFonts w:ascii="Times New Roman" w:cs="Times New Roman" w:eastAsia="Times New Roman" w:hAnsi="Times New Roman"/>
           <w:b w:val="1"/>
+          <w:bCs w:val="1"/>
           <w:sz w:val="24"/>
           <w:szCs w:val="24"/>
           <w:rtl w:val="0"/>
@@ -309,6 +324,7 @@
         <w:rPr>
           <w:rFonts w:ascii="Times New Roman" w:cs="Times New Roman" w:eastAsia="Times New Roman" w:hAnsi="Times New Roman"/>
           <w:b w:val="1"/>
+          <w:bCs w:val="1"/>
           <w:sz w:val="24"/>
           <w:szCs w:val="24"/>
           <w:rtl w:val="0"/>
@@ -355,6 +371,7 @@
         <w:rPr>
           <w:rFonts w:ascii="Times New Roman" w:cs="Times New Roman" w:eastAsia="Times New Roman" w:hAnsi="Times New Roman"/>
           <w:b w:val="1"/>
+          <w:bCs w:val="1"/>
           <w:sz w:val="24"/>
           <w:szCs w:val="24"/>
           <w:rtl w:val="0"/>
@@ -401,6 +418,7 @@
         <w:rPr>
           <w:rFonts w:ascii="Times New Roman" w:cs="Times New Roman" w:eastAsia="Times New Roman" w:hAnsi="Times New Roman"/>
           <w:b w:val="1"/>
+          <w:bCs w:val="1"/>
           <w:sz w:val="24"/>
           <w:szCs w:val="24"/>
           <w:rtl w:val="0"/>
@@ -427,6 +445,7 @@
         <w:rPr>
           <w:rFonts w:ascii="Times New Roman" w:cs="Times New Roman" w:eastAsia="Times New Roman" w:hAnsi="Times New Roman"/>
           <w:b w:val="1"/>
+          <w:bCs w:val="1"/>
           <w:sz w:val="28"/>
           <w:szCs w:val="28"/>
         </w:rPr>
@@ -435,6 +454,7 @@
         <w:rPr>
           <w:rFonts w:ascii="Times New Roman" w:cs="Times New Roman" w:eastAsia="Times New Roman" w:hAnsi="Times New Roman"/>
           <w:b w:val="1"/>
+          <w:bCs w:val="1"/>
           <w:sz w:val="28"/>
           <w:szCs w:val="28"/>
           <w:rtl w:val="0"/>
@@ -482,6 +502,7 @@
         <w:rPr>
           <w:rFonts w:ascii="Times New Roman" w:cs="Times New Roman" w:eastAsia="Times New Roman" w:hAnsi="Times New Roman"/>
           <w:b w:val="1"/>
+          <w:bCs w:val="1"/>
           <w:sz w:val="24"/>
           <w:szCs w:val="24"/>
         </w:rPr>
@@ -490,6 +511,7 @@
         <w:rPr>
           <w:rFonts w:ascii="Times New Roman" w:cs="Times New Roman" w:eastAsia="Times New Roman" w:hAnsi="Times New Roman"/>
           <w:b w:val="1"/>
+          <w:bCs w:val="1"/>
           <w:sz w:val="24"/>
           <w:szCs w:val="24"/>
           <w:rtl w:val="0"/>
@@ -526,6 +548,7 @@
         <w:rPr>
           <w:rFonts w:ascii="Times New Roman" w:cs="Times New Roman" w:eastAsia="Times New Roman" w:hAnsi="Times New Roman"/>
           <w:b w:val="1"/>
+          <w:bCs w:val="1"/>
           <w:sz w:val="24"/>
           <w:szCs w:val="24"/>
           <w:rtl w:val="0"/>
@@ -571,6 +594,7 @@
         <w:rPr>
           <w:rFonts w:ascii="Times New Roman" w:cs="Times New Roman" w:eastAsia="Times New Roman" w:hAnsi="Times New Roman"/>
           <w:b w:val="1"/>
+          <w:bCs w:val="1"/>
           <w:sz w:val="24"/>
           <w:szCs w:val="24"/>
           <w:rtl w:val="0"/>
@@ -616,6 +640,7 @@
         <w:rPr>
           <w:rFonts w:ascii="Times New Roman" w:cs="Times New Roman" w:eastAsia="Times New Roman" w:hAnsi="Times New Roman"/>
           <w:b w:val="1"/>
+          <w:bCs w:val="1"/>
           <w:sz w:val="24"/>
           <w:szCs w:val="24"/>
           <w:rtl w:val="0"/>
@@ -693,6 +718,7 @@
         <w:rPr>
           <w:rFonts w:ascii="Times New Roman" w:cs="Times New Roman" w:eastAsia="Times New Roman" w:hAnsi="Times New Roman"/>
           <w:b w:val="1"/>
+          <w:bCs w:val="1"/>
           <w:sz w:val="28"/>
           <w:szCs w:val="28"/>
         </w:rPr>
@@ -701,6 +727,7 @@
         <w:rPr>
           <w:rFonts w:ascii="Times New Roman" w:cs="Times New Roman" w:eastAsia="Times New Roman" w:hAnsi="Times New Roman"/>
           <w:b w:val="1"/>
+          <w:bCs w:val="1"/>
           <w:sz w:val="28"/>
           <w:szCs w:val="28"/>
           <w:rtl w:val="0"/>
@@ -770,6 +797,7 @@
               <w:rPr>
                 <w:rFonts w:ascii="Times New Roman" w:cs="Times New Roman" w:eastAsia="Times New Roman" w:hAnsi="Times New Roman"/>
                 <w:b w:val="1"/>
+                <w:bCs w:val="1"/>
                 <w:sz w:val="24"/>
                 <w:szCs w:val="24"/>
                 <w:rtl w:val="0"/>
@@ -808,6 +836,7 @@
               <w:rPr>
                 <w:rFonts w:ascii="Times New Roman" w:cs="Times New Roman" w:eastAsia="Times New Roman" w:hAnsi="Times New Roman"/>
                 <w:b w:val="1"/>
+                <w:bCs w:val="1"/>
                 <w:sz w:val="24"/>
                 <w:szCs w:val="24"/>
                 <w:rtl w:val="0"/>
@@ -839,6 +868,7 @@
               <w:rPr>
                 <w:rFonts w:ascii="Times New Roman" w:cs="Times New Roman" w:eastAsia="Times New Roman" w:hAnsi="Times New Roman"/>
                 <w:b w:val="1"/>
+                <w:bCs w:val="1"/>
                 <w:sz w:val="24"/>
                 <w:szCs w:val="24"/>
               </w:rPr>
@@ -847,6 +877,7 @@
               <w:rPr>
                 <w:rFonts w:ascii="Times New Roman" w:cs="Times New Roman" w:eastAsia="Times New Roman" w:hAnsi="Times New Roman"/>
                 <w:b w:val="1"/>
+                <w:bCs w:val="1"/>
                 <w:sz w:val="24"/>
                 <w:szCs w:val="24"/>
                 <w:rtl w:val="0"/>
@@ -873,6 +904,7 @@
               <w:rPr>
                 <w:rFonts w:ascii="Times New Roman" w:cs="Times New Roman" w:eastAsia="Times New Roman" w:hAnsi="Times New Roman"/>
                 <w:b w:val="1"/>
+                <w:bCs w:val="1"/>
                 <w:sz w:val="24"/>
                 <w:szCs w:val="24"/>
               </w:rPr>
@@ -881,6 +913,7 @@
               <w:rPr>
                 <w:rFonts w:ascii="Times New Roman" w:cs="Times New Roman" w:eastAsia="Times New Roman" w:hAnsi="Times New Roman"/>
                 <w:b w:val="1"/>
+                <w:bCs w:val="1"/>
                 <w:sz w:val="24"/>
                 <w:szCs w:val="24"/>
                 <w:rtl w:val="0"/>
@@ -914,6 +947,7 @@
               <w:rPr>
                 <w:rFonts w:ascii="Times New Roman" w:cs="Times New Roman" w:eastAsia="Times New Roman" w:hAnsi="Times New Roman"/>
                 <w:b w:val="1"/>
+                <w:bCs w:val="1"/>
                 <w:sz w:val="24"/>
                 <w:szCs w:val="24"/>
                 <w:rtl w:val="0"/>
@@ -951,6 +985,7 @@
               <w:rPr>
                 <w:rFonts w:ascii="Times New Roman" w:cs="Times New Roman" w:eastAsia="Times New Roman" w:hAnsi="Times New Roman"/>
                 <w:b w:val="1"/>
+                <w:bCs w:val="1"/>
                 <w:sz w:val="24"/>
                 <w:szCs w:val="24"/>
               </w:rPr>
@@ -959,6 +994,7 @@
               <w:rPr>
                 <w:rFonts w:ascii="Times New Roman" w:cs="Times New Roman" w:eastAsia="Times New Roman" w:hAnsi="Times New Roman"/>
                 <w:b w:val="1"/>
+                <w:bCs w:val="1"/>
                 <w:sz w:val="24"/>
                 <w:szCs w:val="24"/>
                 <w:rtl w:val="0"/>
@@ -1081,6 +1117,7 @@
               <w:rPr>
                 <w:rFonts w:ascii="Times New Roman" w:cs="Times New Roman" w:eastAsia="Times New Roman" w:hAnsi="Times New Roman"/>
                 <w:b w:val="1"/>
+                <w:bCs w:val="1"/>
                 <w:sz w:val="24"/>
                 <w:szCs w:val="24"/>
               </w:rPr>
@@ -1089,6 +1126,7 @@
               <w:rPr>
                 <w:rFonts w:ascii="Times New Roman" w:cs="Times New Roman" w:eastAsia="Times New Roman" w:hAnsi="Times New Roman"/>
                 <w:b w:val="1"/>
+                <w:bCs w:val="1"/>
                 <w:sz w:val="24"/>
                 <w:szCs w:val="24"/>
                 <w:rtl w:val="0"/>
@@ -1121,6 +1159,7 @@
               <w:rPr>
                 <w:rFonts w:ascii="Times New Roman" w:cs="Times New Roman" w:eastAsia="Times New Roman" w:hAnsi="Times New Roman"/>
                 <w:b w:val="1"/>
+                <w:bCs w:val="1"/>
                 <w:sz w:val="24"/>
                 <w:szCs w:val="24"/>
               </w:rPr>
@@ -1129,6 +1168,7 @@
               <w:rPr>
                 <w:rFonts w:ascii="Times New Roman" w:cs="Times New Roman" w:eastAsia="Times New Roman" w:hAnsi="Times New Roman"/>
                 <w:b w:val="1"/>
+                <w:bCs w:val="1"/>
                 <w:sz w:val="24"/>
                 <w:szCs w:val="24"/>
                 <w:rtl w:val="0"/>
@@ -1251,6 +1291,7 @@
               <w:rPr>
                 <w:rFonts w:ascii="Times New Roman" w:cs="Times New Roman" w:eastAsia="Times New Roman" w:hAnsi="Times New Roman"/>
                 <w:b w:val="1"/>
+                <w:bCs w:val="1"/>
                 <w:sz w:val="24"/>
                 <w:szCs w:val="24"/>
               </w:rPr>
@@ -1259,6 +1300,7 @@
               <w:rPr>
                 <w:rFonts w:ascii="Times New Roman" w:cs="Times New Roman" w:eastAsia="Times New Roman" w:hAnsi="Times New Roman"/>
                 <w:b w:val="1"/>
+                <w:bCs w:val="1"/>
                 <w:sz w:val="24"/>
                 <w:szCs w:val="24"/>
                 <w:rtl w:val="0"/>
@@ -1291,6 +1333,7 @@
               <w:rPr>
                 <w:rFonts w:ascii="Times New Roman" w:cs="Times New Roman" w:eastAsia="Times New Roman" w:hAnsi="Times New Roman"/>
                 <w:b w:val="1"/>
+                <w:bCs w:val="1"/>
                 <w:sz w:val="24"/>
                 <w:szCs w:val="24"/>
               </w:rPr>
@@ -1299,6 +1342,7 @@
               <w:rPr>
                 <w:rFonts w:ascii="Times New Roman" w:cs="Times New Roman" w:eastAsia="Times New Roman" w:hAnsi="Times New Roman"/>
                 <w:b w:val="1"/>
+                <w:bCs w:val="1"/>
                 <w:sz w:val="24"/>
                 <w:szCs w:val="24"/>
                 <w:rtl w:val="0"/>
@@ -1455,6 +1499,7 @@
               <w:rPr>
                 <w:rFonts w:ascii="Times New Roman" w:cs="Times New Roman" w:eastAsia="Times New Roman" w:hAnsi="Times New Roman"/>
                 <w:b w:val="1"/>
+                <w:bCs w:val="1"/>
                 <w:sz w:val="24"/>
                 <w:szCs w:val="24"/>
               </w:rPr>
@@ -1463,6 +1508,7 @@
               <w:rPr>
                 <w:rFonts w:ascii="Times New Roman" w:cs="Times New Roman" w:eastAsia="Times New Roman" w:hAnsi="Times New Roman"/>
                 <w:b w:val="1"/>
+                <w:bCs w:val="1"/>
                 <w:sz w:val="24"/>
                 <w:szCs w:val="24"/>
                 <w:rtl w:val="0"/>
@@ -1495,6 +1541,7 @@
               <w:rPr>
                 <w:rFonts w:ascii="Times New Roman" w:cs="Times New Roman" w:eastAsia="Times New Roman" w:hAnsi="Times New Roman"/>
                 <w:b w:val="1"/>
+                <w:bCs w:val="1"/>
                 <w:sz w:val="24"/>
                 <w:szCs w:val="24"/>
               </w:rPr>
@@ -1503,6 +1550,7 @@
               <w:rPr>
                 <w:rFonts w:ascii="Times New Roman" w:cs="Times New Roman" w:eastAsia="Times New Roman" w:hAnsi="Times New Roman"/>
                 <w:b w:val="1"/>
+                <w:bCs w:val="1"/>
                 <w:sz w:val="24"/>
                 <w:szCs w:val="24"/>
                 <w:rtl w:val="0"/>
@@ -1625,6 +1673,7 @@
               <w:rPr>
                 <w:rFonts w:ascii="Times New Roman" w:cs="Times New Roman" w:eastAsia="Times New Roman" w:hAnsi="Times New Roman"/>
                 <w:b w:val="1"/>
+                <w:bCs w:val="1"/>
                 <w:sz w:val="24"/>
                 <w:szCs w:val="24"/>
               </w:rPr>
@@ -1633,6 +1682,7 @@
               <w:rPr>
                 <w:rFonts w:ascii="Times New Roman" w:cs="Times New Roman" w:eastAsia="Times New Roman" w:hAnsi="Times New Roman"/>
                 <w:b w:val="1"/>
+                <w:bCs w:val="1"/>
                 <w:sz w:val="24"/>
                 <w:szCs w:val="24"/>
                 <w:rtl w:val="0"/>
@@ -1665,6 +1715,7 @@
               <w:rPr>
                 <w:rFonts w:ascii="Times New Roman" w:cs="Times New Roman" w:eastAsia="Times New Roman" w:hAnsi="Times New Roman"/>
                 <w:b w:val="1"/>
+                <w:bCs w:val="1"/>
                 <w:sz w:val="24"/>
                 <w:szCs w:val="24"/>
               </w:rPr>
@@ -1673,6 +1724,7 @@
               <w:rPr>
                 <w:rFonts w:ascii="Times New Roman" w:cs="Times New Roman" w:eastAsia="Times New Roman" w:hAnsi="Times New Roman"/>
                 <w:b w:val="1"/>
+                <w:bCs w:val="1"/>
                 <w:sz w:val="24"/>
                 <w:szCs w:val="24"/>
                 <w:rtl w:val="0"/>
@@ -1841,6 +1893,7 @@
               <w:rPr>
                 <w:rFonts w:ascii="Times New Roman" w:cs="Times New Roman" w:eastAsia="Times New Roman" w:hAnsi="Times New Roman"/>
                 <w:b w:val="1"/>
+                <w:bCs w:val="1"/>
                 <w:sz w:val="24"/>
                 <w:szCs w:val="24"/>
               </w:rPr>
@@ -1849,6 +1902,7 @@
               <w:rPr>
                 <w:rFonts w:ascii="Times New Roman" w:cs="Times New Roman" w:eastAsia="Times New Roman" w:hAnsi="Times New Roman"/>
                 <w:b w:val="1"/>
+                <w:bCs w:val="1"/>
                 <w:sz w:val="24"/>
                 <w:szCs w:val="24"/>
                 <w:rtl w:val="0"/>
@@ -1882,6 +1936,7 @@
               <w:rPr>
                 <w:rFonts w:ascii="Times New Roman" w:cs="Times New Roman" w:eastAsia="Times New Roman" w:hAnsi="Times New Roman"/>
                 <w:b w:val="1"/>
+                <w:bCs w:val="1"/>
                 <w:sz w:val="24"/>
                 <w:szCs w:val="24"/>
               </w:rPr>
@@ -1890,6 +1945,7 @@
               <w:rPr>
                 <w:rFonts w:ascii="Times New Roman" w:cs="Times New Roman" w:eastAsia="Times New Roman" w:hAnsi="Times New Roman"/>
                 <w:b w:val="1"/>
+                <w:bCs w:val="1"/>
                 <w:sz w:val="24"/>
                 <w:szCs w:val="24"/>
                 <w:rtl w:val="0"/>
@@ -2012,6 +2068,7 @@
               <w:rPr>
                 <w:rFonts w:ascii="Times New Roman" w:cs="Times New Roman" w:eastAsia="Times New Roman" w:hAnsi="Times New Roman"/>
                 <w:b w:val="1"/>
+                <w:bCs w:val="1"/>
                 <w:sz w:val="24"/>
                 <w:szCs w:val="24"/>
               </w:rPr>
@@ -2020,6 +2077,7 @@
               <w:rPr>
                 <w:rFonts w:ascii="Times New Roman" w:cs="Times New Roman" w:eastAsia="Times New Roman" w:hAnsi="Times New Roman"/>
                 <w:b w:val="1"/>
+                <w:bCs w:val="1"/>
                 <w:sz w:val="24"/>
                 <w:szCs w:val="24"/>
                 <w:rtl w:val="0"/>
@@ -2052,6 +2110,7 @@
               <w:rPr>
                 <w:rFonts w:ascii="Times New Roman" w:cs="Times New Roman" w:eastAsia="Times New Roman" w:hAnsi="Times New Roman"/>
                 <w:b w:val="1"/>
+                <w:bCs w:val="1"/>
                 <w:sz w:val="24"/>
                 <w:szCs w:val="24"/>
               </w:rPr>
@@ -2060,6 +2119,7 @@
               <w:rPr>
                 <w:rFonts w:ascii="Times New Roman" w:cs="Times New Roman" w:eastAsia="Times New Roman" w:hAnsi="Times New Roman"/>
                 <w:b w:val="1"/>
+                <w:bCs w:val="1"/>
                 <w:sz w:val="24"/>
                 <w:szCs w:val="24"/>
                 <w:rtl w:val="0"/>
@@ -2182,6 +2242,7 @@
               <w:rPr>
                 <w:rFonts w:ascii="Times New Roman" w:cs="Times New Roman" w:eastAsia="Times New Roman" w:hAnsi="Times New Roman"/>
                 <w:b w:val="1"/>
+                <w:bCs w:val="1"/>
                 <w:sz w:val="24"/>
                 <w:szCs w:val="24"/>
               </w:rPr>
@@ -2190,6 +2251,7 @@
               <w:rPr>
                 <w:rFonts w:ascii="Times New Roman" w:cs="Times New Roman" w:eastAsia="Times New Roman" w:hAnsi="Times New Roman"/>
                 <w:b w:val="1"/>
+                <w:bCs w:val="1"/>
                 <w:sz w:val="24"/>
                 <w:szCs w:val="24"/>
                 <w:rtl w:val="0"/>
@@ -2222,6 +2284,7 @@
               <w:rPr>
                 <w:rFonts w:ascii="Times New Roman" w:cs="Times New Roman" w:eastAsia="Times New Roman" w:hAnsi="Times New Roman"/>
                 <w:b w:val="1"/>
+                <w:bCs w:val="1"/>
                 <w:sz w:val="24"/>
                 <w:szCs w:val="24"/>
               </w:rPr>
@@ -2230,6 +2293,7 @@
               <w:rPr>
                 <w:rFonts w:ascii="Times New Roman" w:cs="Times New Roman" w:eastAsia="Times New Roman" w:hAnsi="Times New Roman"/>
                 <w:b w:val="1"/>
+                <w:bCs w:val="1"/>
                 <w:sz w:val="24"/>
                 <w:szCs w:val="24"/>
                 <w:rtl w:val="0"/>
@@ -2371,6 +2435,7 @@
               <w:rPr>
                 <w:rFonts w:ascii="Times New Roman" w:cs="Times New Roman" w:eastAsia="Times New Roman" w:hAnsi="Times New Roman"/>
                 <w:b w:val="1"/>
+                <w:bCs w:val="1"/>
                 <w:sz w:val="24"/>
                 <w:szCs w:val="24"/>
               </w:rPr>
@@ -2379,6 +2444,7 @@
               <w:rPr>
                 <w:rFonts w:ascii="Times New Roman" w:cs="Times New Roman" w:eastAsia="Times New Roman" w:hAnsi="Times New Roman"/>
                 <w:b w:val="1"/>
+                <w:bCs w:val="1"/>
                 <w:sz w:val="24"/>
                 <w:szCs w:val="24"/>
                 <w:rtl w:val="0"/>
@@ -2399,6 +2465,7 @@
         <w:rPr>
           <w:rFonts w:ascii="Times New Roman" w:cs="Times New Roman" w:eastAsia="Times New Roman" w:hAnsi="Times New Roman"/>
           <w:b w:val="1"/>
+          <w:bCs w:val="1"/>
           <w:sz w:val="28"/>
           <w:szCs w:val="28"/>
         </w:rPr>
@@ -2407,6 +2474,7 @@
         <w:rPr>
           <w:rFonts w:ascii="Times New Roman" w:cs="Times New Roman" w:eastAsia="Times New Roman" w:hAnsi="Times New Roman"/>
           <w:b w:val="1"/>
+          <w:bCs w:val="1"/>
           <w:sz w:val="28"/>
           <w:szCs w:val="28"/>
           <w:rtl w:val="0"/>
@@ -2443,6 +2511,7 @@
         <w:rPr>
           <w:rFonts w:ascii="Times New Roman" w:cs="Times New Roman" w:eastAsia="Times New Roman" w:hAnsi="Times New Roman"/>
           <w:b w:val="1"/>
+          <w:bCs w:val="1"/>
           <w:sz w:val="24"/>
           <w:szCs w:val="24"/>
           <w:rtl w:val="0"/>
@@ -2488,6 +2557,7 @@
         <w:rPr>
           <w:rFonts w:ascii="Times New Roman" w:cs="Times New Roman" w:eastAsia="Times New Roman" w:hAnsi="Times New Roman"/>
           <w:b w:val="1"/>
+          <w:bCs w:val="1"/>
           <w:sz w:val="24"/>
           <w:szCs w:val="24"/>
           <w:rtl w:val="0"/>
@@ -2533,6 +2603,7 @@
         <w:rPr>
           <w:rFonts w:ascii="Times New Roman" w:cs="Times New Roman" w:eastAsia="Times New Roman" w:hAnsi="Times New Roman"/>
           <w:b w:val="1"/>
+          <w:bCs w:val="1"/>
           <w:sz w:val="24"/>
           <w:szCs w:val="24"/>
           <w:rtl w:val="0"/>
@@ -2578,6 +2649,7 @@
         <w:rPr>
           <w:rFonts w:ascii="Times New Roman" w:cs="Times New Roman" w:eastAsia="Times New Roman" w:hAnsi="Times New Roman"/>
           <w:b w:val="1"/>
+          <w:bCs w:val="1"/>
           <w:sz w:val="24"/>
           <w:szCs w:val="24"/>
           <w:rtl w:val="0"/>
@@ -2623,6 +2695,7 @@
         <w:rPr>
           <w:rFonts w:ascii="Times New Roman" w:cs="Times New Roman" w:eastAsia="Times New Roman" w:hAnsi="Times New Roman"/>
           <w:b w:val="1"/>
+          <w:bCs w:val="1"/>
           <w:sz w:val="24"/>
           <w:szCs w:val="24"/>
           <w:rtl w:val="0"/>
@@ -2668,6 +2741,7 @@
         <w:rPr>
           <w:rFonts w:ascii="Times New Roman" w:cs="Times New Roman" w:eastAsia="Times New Roman" w:hAnsi="Times New Roman"/>
           <w:b w:val="1"/>
+          <w:bCs w:val="1"/>
           <w:sz w:val="24"/>
           <w:szCs w:val="24"/>
           <w:rtl w:val="0"/>
@@ -2709,6 +2783,7 @@
         <w:rPr>
           <w:rFonts w:ascii="Times New Roman" w:cs="Times New Roman" w:eastAsia="Times New Roman" w:hAnsi="Times New Roman"/>
           <w:b w:val="1"/>
+          <w:bCs w:val="1"/>
           <w:sz w:val="28"/>
           <w:szCs w:val="28"/>
         </w:rPr>
@@ -2719,6 +2794,7 @@
         <w:rPr>
           <w:rFonts w:ascii="Times New Roman" w:cs="Times New Roman" w:eastAsia="Times New Roman" w:hAnsi="Times New Roman"/>
           <w:b w:val="1"/>
+          <w:bCs w:val="1"/>
           <w:sz w:val="28"/>
           <w:szCs w:val="28"/>
           <w:rtl w:val="0"/>
@@ -2742,6 +2818,7 @@
         <w:rPr>
           <w:rFonts w:ascii="Times New Roman" w:cs="Times New Roman" w:eastAsia="Times New Roman" w:hAnsi="Times New Roman"/>
           <w:b w:val="1"/>
+          <w:bCs w:val="1"/>
           <w:sz w:val="24"/>
           <w:szCs w:val="24"/>
           <w:rtl w:val="0"/>
@@ -2785,6 +2862,7 @@
         <w:rPr>
           <w:rFonts w:ascii="Times New Roman" w:cs="Times New Roman" w:eastAsia="Times New Roman" w:hAnsi="Times New Roman"/>
           <w:b w:val="1"/>
+          <w:bCs w:val="1"/>
           <w:sz w:val="24"/>
           <w:szCs w:val="24"/>
           <w:rtl w:val="0"/>
@@ -2828,6 +2906,7 @@
         <w:rPr>
           <w:rFonts w:ascii="Times New Roman" w:cs="Times New Roman" w:eastAsia="Times New Roman" w:hAnsi="Times New Roman"/>
           <w:b w:val="1"/>
+          <w:bCs w:val="1"/>
           <w:sz w:val="24"/>
           <w:szCs w:val="24"/>
           <w:rtl w:val="0"/>
@@ -2871,6 +2950,7 @@
         <w:rPr>
           <w:rFonts w:ascii="Times New Roman" w:cs="Times New Roman" w:eastAsia="Times New Roman" w:hAnsi="Times New Roman"/>
           <w:b w:val="1"/>
+          <w:bCs w:val="1"/>
           <w:sz w:val="24"/>
           <w:szCs w:val="24"/>
           <w:rtl w:val="0"/>
@@ -2909,12 +2989,14 @@
         <w:rPr>
           <w:rFonts w:ascii="Times New Roman" w:cs="Times New Roman" w:eastAsia="Times New Roman" w:hAnsi="Times New Roman"/>
           <w:b w:val="1"/>
+          <w:bCs w:val="1"/>
         </w:rPr>
       </w:pPr>
       <w:r>
         <w:rPr>
           <w:rFonts w:ascii="Times New Roman" w:cs="Times New Roman" w:eastAsia="Times New Roman" w:hAnsi="Times New Roman"/>
           <w:b w:val="1"/>
+          <w:bCs w:val="1"/>
           <w:sz w:val="24"/>
           <w:szCs w:val="24"/>
           <w:rtl w:val="0"/>
@@ -3048,6 +3130,7 @@
         <w:rPr>
           <w:rFonts w:ascii="Times New Roman" w:cs="Times New Roman" w:eastAsia="Times New Roman" w:hAnsi="Times New Roman"/>
           <w:b w:val="1"/>
+          <w:bCs w:val="1"/>
           <w:sz w:val="24"/>
           <w:szCs w:val="24"/>
           <w:u w:val="none"/>
@@ -3057,6 +3140,7 @@
         <w:rPr>
           <w:rFonts w:ascii="Times New Roman" w:cs="Times New Roman" w:eastAsia="Times New Roman" w:hAnsi="Times New Roman"/>
           <w:b w:val="1"/>
+          <w:bCs w:val="1"/>
           <w:sz w:val="24"/>
           <w:szCs w:val="24"/>
           <w:rtl w:val="0"/>
@@ -3190,12 +3274,14 @@
         <w:rPr>
           <w:rFonts w:ascii="Times New Roman" w:cs="Times New Roman" w:eastAsia="Times New Roman" w:hAnsi="Times New Roman"/>
           <w:b w:val="1"/>
+          <w:bCs w:val="1"/>
         </w:rPr>
       </w:pPr>
       <w:r>
         <w:rPr>
           <w:rFonts w:ascii="Times New Roman" w:cs="Times New Roman" w:eastAsia="Times New Roman" w:hAnsi="Times New Roman"/>
           <w:b w:val="1"/>
+          <w:bCs w:val="1"/>
           <w:sz w:val="24"/>
           <w:szCs w:val="24"/>
           <w:rtl w:val="0"/>
@@ -3356,6 +3442,7 @@
         <w:rPr>
           <w:rFonts w:ascii="Times New Roman" w:cs="Times New Roman" w:eastAsia="Times New Roman" w:hAnsi="Times New Roman"/>
           <w:b w:val="1"/>
+          <w:bCs w:val="1"/>
           <w:sz w:val="28"/>
           <w:szCs w:val="28"/>
           <w:rtl w:val="0"/>
@@ -3424,6 +3511,7 @@
               <w:rPr>
                 <w:rFonts w:ascii="Times New Roman" w:cs="Times New Roman" w:eastAsia="Times New Roman" w:hAnsi="Times New Roman"/>
                 <w:b w:val="1"/>
+                <w:bCs w:val="1"/>
                 <w:sz w:val="24"/>
                 <w:szCs w:val="24"/>
                 <w:rtl w:val="0"/>
@@ -3462,6 +3550,7 @@
               <w:rPr>
                 <w:rFonts w:ascii="Times New Roman" w:cs="Times New Roman" w:eastAsia="Times New Roman" w:hAnsi="Times New Roman"/>
                 <w:b w:val="1"/>
+                <w:bCs w:val="1"/>
                 <w:sz w:val="24"/>
                 <w:szCs w:val="24"/>
                 <w:rtl w:val="0"/>
@@ -3499,6 +3588,7 @@
               <w:rPr>
                 <w:rFonts w:ascii="Times New Roman" w:cs="Times New Roman" w:eastAsia="Times New Roman" w:hAnsi="Times New Roman"/>
                 <w:b w:val="1"/>
+                <w:bCs w:val="1"/>
                 <w:sz w:val="24"/>
                 <w:szCs w:val="24"/>
               </w:rPr>
@@ -3507,6 +3597,7 @@
               <w:rPr>
                 <w:rFonts w:ascii="Times New Roman" w:cs="Times New Roman" w:eastAsia="Times New Roman" w:hAnsi="Times New Roman"/>
                 <w:b w:val="1"/>
+                <w:bCs w:val="1"/>
                 <w:sz w:val="24"/>
                 <w:szCs w:val="24"/>
                 <w:rtl w:val="0"/>
@@ -3571,6 +3662,7 @@
               <w:rPr>
                 <w:rFonts w:ascii="Times New Roman" w:cs="Times New Roman" w:eastAsia="Times New Roman" w:hAnsi="Times New Roman"/>
                 <w:b w:val="1"/>
+                <w:bCs w:val="1"/>
                 <w:sz w:val="24"/>
                 <w:szCs w:val="24"/>
               </w:rPr>
@@ -3579,6 +3671,7 @@
               <w:rPr>
                 <w:rFonts w:ascii="Times New Roman" w:cs="Times New Roman" w:eastAsia="Times New Roman" w:hAnsi="Times New Roman"/>
                 <w:b w:val="1"/>
+                <w:bCs w:val="1"/>
                 <w:sz w:val="24"/>
                 <w:szCs w:val="24"/>
                 <w:rtl w:val="0"/>
@@ -3643,6 +3736,7 @@
               <w:rPr>
                 <w:rFonts w:ascii="Times New Roman" w:cs="Times New Roman" w:eastAsia="Times New Roman" w:hAnsi="Times New Roman"/>
                 <w:b w:val="1"/>
+                <w:bCs w:val="1"/>
                 <w:sz w:val="24"/>
                 <w:szCs w:val="24"/>
               </w:rPr>
@@ -3651,6 +3745,7 @@
               <w:rPr>
                 <w:rFonts w:ascii="Times New Roman" w:cs="Times New Roman" w:eastAsia="Times New Roman" w:hAnsi="Times New Roman"/>
                 <w:b w:val="1"/>
+                <w:bCs w:val="1"/>
                 <w:sz w:val="24"/>
                 <w:szCs w:val="24"/>
                 <w:rtl w:val="0"/>
@@ -3715,6 +3810,7 @@
               <w:rPr>
                 <w:rFonts w:ascii="Times New Roman" w:cs="Times New Roman" w:eastAsia="Times New Roman" w:hAnsi="Times New Roman"/>
                 <w:b w:val="1"/>
+                <w:bCs w:val="1"/>
                 <w:sz w:val="24"/>
                 <w:szCs w:val="24"/>
               </w:rPr>
@@ -3723,6 +3819,7 @@
               <w:rPr>
                 <w:rFonts w:ascii="Times New Roman" w:cs="Times New Roman" w:eastAsia="Times New Roman" w:hAnsi="Times New Roman"/>
                 <w:b w:val="1"/>
+                <w:bCs w:val="1"/>
                 <w:sz w:val="24"/>
                 <w:szCs w:val="24"/>
                 <w:rtl w:val="0"/>
@@ -3787,6 +3884,7 @@
               <w:rPr>
                 <w:rFonts w:ascii="Times New Roman" w:cs="Times New Roman" w:eastAsia="Times New Roman" w:hAnsi="Times New Roman"/>
                 <w:b w:val="1"/>
+                <w:bCs w:val="1"/>
                 <w:sz w:val="24"/>
                 <w:szCs w:val="24"/>
               </w:rPr>
@@ -3795,6 +3893,7 @@
               <w:rPr>
                 <w:rFonts w:ascii="Times New Roman" w:cs="Times New Roman" w:eastAsia="Times New Roman" w:hAnsi="Times New Roman"/>
                 <w:b w:val="1"/>
+                <w:bCs w:val="1"/>
                 <w:sz w:val="24"/>
                 <w:szCs w:val="24"/>
                 <w:rtl w:val="0"/>
@@ -3859,6 +3958,7 @@
               <w:rPr>
                 <w:rFonts w:ascii="Times New Roman" w:cs="Times New Roman" w:eastAsia="Times New Roman" w:hAnsi="Times New Roman"/>
                 <w:b w:val="1"/>
+                <w:bCs w:val="1"/>
                 <w:sz w:val="24"/>
                 <w:szCs w:val="24"/>
               </w:rPr>
@@ -3867,6 +3967,7 @@
               <w:rPr>
                 <w:rFonts w:ascii="Times New Roman" w:cs="Times New Roman" w:eastAsia="Times New Roman" w:hAnsi="Times New Roman"/>
                 <w:b w:val="1"/>
+                <w:bCs w:val="1"/>
                 <w:sz w:val="24"/>
                 <w:szCs w:val="24"/>
                 <w:rtl w:val="0"/>
@@ -3937,6 +4038,7 @@
         <w:rPr>
           <w:rFonts w:ascii="Times New Roman" w:cs="Times New Roman" w:eastAsia="Times New Roman" w:hAnsi="Times New Roman"/>
           <w:b w:val="1"/>
+          <w:bCs w:val="1"/>
           <w:sz w:val="28"/>
           <w:szCs w:val="28"/>
         </w:rPr>
@@ -3945,6 +4047,7 @@
         <w:rPr>
           <w:rFonts w:ascii="Times New Roman" w:cs="Times New Roman" w:eastAsia="Times New Roman" w:hAnsi="Times New Roman"/>
           <w:b w:val="1"/>
+          <w:bCs w:val="1"/>
           <w:sz w:val="28"/>
           <w:szCs w:val="28"/>
           <w:rtl w:val="0"/>
@@ -4020,6 +4123,7 @@
               <w:rPr>
                 <w:rFonts w:ascii="Times New Roman" w:cs="Times New Roman" w:eastAsia="Times New Roman" w:hAnsi="Times New Roman"/>
                 <w:b w:val="1"/>
+                <w:bCs w:val="1"/>
                 <w:sz w:val="24"/>
                 <w:szCs w:val="24"/>
               </w:rPr>
@@ -4028,6 +4132,7 @@
               <w:rPr>
                 <w:rFonts w:ascii="Times New Roman" w:cs="Times New Roman" w:eastAsia="Times New Roman" w:hAnsi="Times New Roman"/>
                 <w:b w:val="1"/>
+                <w:bCs w:val="1"/>
                 <w:sz w:val="24"/>
                 <w:szCs w:val="24"/>
                 <w:rtl w:val="0"/>
@@ -4067,6 +4172,7 @@
               <w:rPr>
                 <w:rFonts w:ascii="Times New Roman" w:cs="Times New Roman" w:eastAsia="Times New Roman" w:hAnsi="Times New Roman"/>
                 <w:b w:val="1"/>
+                <w:bCs w:val="1"/>
                 <w:sz w:val="24"/>
                 <w:szCs w:val="24"/>
               </w:rPr>
@@ -4075,6 +4181,7 @@
               <w:rPr>
                 <w:rFonts w:ascii="Times New Roman" w:cs="Times New Roman" w:eastAsia="Times New Roman" w:hAnsi="Times New Roman"/>
                 <w:b w:val="1"/>
+                <w:bCs w:val="1"/>
                 <w:sz w:val="24"/>
                 <w:szCs w:val="24"/>
                 <w:rtl w:val="0"/>
@@ -4114,6 +4221,7 @@
               <w:rPr>
                 <w:rFonts w:ascii="Times New Roman" w:cs="Times New Roman" w:eastAsia="Times New Roman" w:hAnsi="Times New Roman"/>
                 <w:b w:val="1"/>
+                <w:bCs w:val="1"/>
                 <w:sz w:val="24"/>
                 <w:szCs w:val="24"/>
               </w:rPr>
@@ -4122,6 +4230,7 @@
               <w:rPr>
                 <w:rFonts w:ascii="Times New Roman" w:cs="Times New Roman" w:eastAsia="Times New Roman" w:hAnsi="Times New Roman"/>
                 <w:b w:val="1"/>
+                <w:bCs w:val="1"/>
                 <w:sz w:val="24"/>
                 <w:szCs w:val="24"/>
                 <w:rtl w:val="0"/>
@@ -4161,6 +4270,7 @@
               <w:rPr>
                 <w:rFonts w:ascii="Times New Roman" w:cs="Times New Roman" w:eastAsia="Times New Roman" w:hAnsi="Times New Roman"/>
                 <w:b w:val="1"/>
+                <w:bCs w:val="1"/>
                 <w:sz w:val="24"/>
                 <w:szCs w:val="24"/>
               </w:rPr>
@@ -4169,6 +4279,7 @@
               <w:rPr>
                 <w:rFonts w:ascii="Times New Roman" w:cs="Times New Roman" w:eastAsia="Times New Roman" w:hAnsi="Times New Roman"/>
                 <w:b w:val="1"/>
+                <w:bCs w:val="1"/>
                 <w:sz w:val="24"/>
                 <w:szCs w:val="24"/>
                 <w:rtl w:val="0"/>
@@ -4208,6 +4319,7 @@
               <w:rPr>
                 <w:rFonts w:ascii="Times New Roman" w:cs="Times New Roman" w:eastAsia="Times New Roman" w:hAnsi="Times New Roman"/>
                 <w:b w:val="1"/>
+                <w:bCs w:val="1"/>
                 <w:sz w:val="24"/>
                 <w:szCs w:val="24"/>
               </w:rPr>
@@ -4216,6 +4328,7 @@
               <w:rPr>
                 <w:rFonts w:ascii="Times New Roman" w:cs="Times New Roman" w:eastAsia="Times New Roman" w:hAnsi="Times New Roman"/>
                 <w:b w:val="1"/>
+                <w:bCs w:val="1"/>
                 <w:sz w:val="24"/>
                 <w:szCs w:val="24"/>
                 <w:rtl w:val="0"/>
@@ -4249,6 +4362,7 @@
               <w:rPr>
                 <w:rFonts w:ascii="Times New Roman" w:cs="Times New Roman" w:eastAsia="Times New Roman" w:hAnsi="Times New Roman"/>
                 <w:b w:val="1"/>
+                <w:bCs w:val="1"/>
                 <w:sz w:val="24"/>
                 <w:szCs w:val="24"/>
               </w:rPr>
@@ -4257,6 +4371,7 @@
               <w:rPr>
                 <w:rFonts w:ascii="Times New Roman" w:cs="Times New Roman" w:eastAsia="Times New Roman" w:hAnsi="Times New Roman"/>
                 <w:b w:val="1"/>
+                <w:bCs w:val="1"/>
                 <w:sz w:val="24"/>
                 <w:szCs w:val="24"/>
                 <w:rtl w:val="0"/>
@@ -4470,6 +4585,7 @@
               <w:rPr>
                 <w:rFonts w:ascii="Times New Roman" w:cs="Times New Roman" w:eastAsia="Times New Roman" w:hAnsi="Times New Roman"/>
                 <w:b w:val="1"/>
+                <w:bCs w:val="1"/>
                 <w:sz w:val="24"/>
                 <w:szCs w:val="24"/>
               </w:rPr>
@@ -4478,6 +4594,7 @@
               <w:rPr>
                 <w:rFonts w:ascii="Times New Roman" w:cs="Times New Roman" w:eastAsia="Times New Roman" w:hAnsi="Times New Roman"/>
                 <w:b w:val="1"/>
+                <w:bCs w:val="1"/>
                 <w:sz w:val="24"/>
                 <w:szCs w:val="24"/>
                 <w:rtl w:val="0"/>
@@ -4679,6 +4796,7 @@
               <w:rPr>
                 <w:rFonts w:ascii="Times New Roman" w:cs="Times New Roman" w:eastAsia="Times New Roman" w:hAnsi="Times New Roman"/>
                 <w:b w:val="1"/>
+                <w:bCs w:val="1"/>
                 <w:sz w:val="24"/>
                 <w:szCs w:val="24"/>
               </w:rPr>
@@ -4687,6 +4805,7 @@
               <w:rPr>
                 <w:rFonts w:ascii="Times New Roman" w:cs="Times New Roman" w:eastAsia="Times New Roman" w:hAnsi="Times New Roman"/>
                 <w:b w:val="1"/>
+                <w:bCs w:val="1"/>
                 <w:sz w:val="24"/>
                 <w:szCs w:val="24"/>
                 <w:rtl w:val="0"/>
@@ -4912,6 +5031,7 @@
               <w:rPr>
                 <w:rFonts w:ascii="Times New Roman" w:cs="Times New Roman" w:eastAsia="Times New Roman" w:hAnsi="Times New Roman"/>
                 <w:b w:val="1"/>
+                <w:bCs w:val="1"/>
                 <w:sz w:val="24"/>
                 <w:szCs w:val="24"/>
               </w:rPr>
@@ -4920,6 +5040,7 @@
               <w:rPr>
                 <w:rFonts w:ascii="Times New Roman" w:cs="Times New Roman" w:eastAsia="Times New Roman" w:hAnsi="Times New Roman"/>
                 <w:b w:val="1"/>
+                <w:bCs w:val="1"/>
                 <w:sz w:val="24"/>
                 <w:szCs w:val="24"/>
                 <w:rtl w:val="0"/>
@@ -5121,6 +5242,7 @@
               <w:rPr>
                 <w:rFonts w:ascii="Times New Roman" w:cs="Times New Roman" w:eastAsia="Times New Roman" w:hAnsi="Times New Roman"/>
                 <w:b w:val="1"/>
+                <w:bCs w:val="1"/>
                 <w:sz w:val="24"/>
                 <w:szCs w:val="24"/>
               </w:rPr>
@@ -5129,6 +5251,7 @@
               <w:rPr>
                 <w:rFonts w:ascii="Times New Roman" w:cs="Times New Roman" w:eastAsia="Times New Roman" w:hAnsi="Times New Roman"/>
                 <w:b w:val="1"/>
+                <w:bCs w:val="1"/>
                 <w:sz w:val="24"/>
                 <w:szCs w:val="24"/>
                 <w:rtl w:val="0"/>
@@ -5354,6 +5477,7 @@
               <w:rPr>
                 <w:rFonts w:ascii="Times New Roman" w:cs="Times New Roman" w:eastAsia="Times New Roman" w:hAnsi="Times New Roman"/>
                 <w:b w:val="1"/>
+                <w:bCs w:val="1"/>
                 <w:sz w:val="24"/>
                 <w:szCs w:val="24"/>
               </w:rPr>
@@ -5362,6 +5486,7 @@
               <w:rPr>
                 <w:rFonts w:ascii="Times New Roman" w:cs="Times New Roman" w:eastAsia="Times New Roman" w:hAnsi="Times New Roman"/>
                 <w:b w:val="1"/>
+                <w:bCs w:val="1"/>
                 <w:sz w:val="24"/>
                 <w:szCs w:val="24"/>
                 <w:rtl w:val="0"/>
@@ -5587,6 +5712,7 @@
               <w:rPr>
                 <w:rFonts w:ascii="Times New Roman" w:cs="Times New Roman" w:eastAsia="Times New Roman" w:hAnsi="Times New Roman"/>
                 <w:b w:val="1"/>
+                <w:bCs w:val="1"/>
                 <w:sz w:val="24"/>
                 <w:szCs w:val="24"/>
               </w:rPr>
@@ -5595,6 +5721,7 @@
               <w:rPr>
                 <w:rFonts w:ascii="Times New Roman" w:cs="Times New Roman" w:eastAsia="Times New Roman" w:hAnsi="Times New Roman"/>
                 <w:b w:val="1"/>
+                <w:bCs w:val="1"/>
                 <w:sz w:val="24"/>
                 <w:szCs w:val="24"/>
                 <w:rtl w:val="0"/>
@@ -5795,6 +5922,7 @@
         <w:rPr>
           <w:rFonts w:ascii="Times New Roman" w:cs="Times New Roman" w:eastAsia="Times New Roman" w:hAnsi="Times New Roman"/>
           <w:b w:val="1"/>
+          <w:bCs w:val="1"/>
           <w:sz w:val="28"/>
           <w:szCs w:val="28"/>
         </w:rPr>
@@ -5803,6 +5931,7 @@
         <w:rPr>
           <w:rFonts w:ascii="Times New Roman" w:cs="Times New Roman" w:eastAsia="Times New Roman" w:hAnsi="Times New Roman"/>
           <w:b w:val="1"/>
+          <w:bCs w:val="1"/>
           <w:sz w:val="28"/>
           <w:szCs w:val="28"/>
           <w:rtl w:val="0"/>
@@ -5820,6 +5949,7 @@
         <w:rPr>
           <w:rFonts w:ascii="Times New Roman" w:cs="Times New Roman" w:eastAsia="Times New Roman" w:hAnsi="Times New Roman"/>
           <w:b w:val="1"/>
+          <w:bCs w:val="1"/>
           <w:sz w:val="28"/>
           <w:szCs w:val="28"/>
         </w:rPr>
@@ -5828,6 +5958,7 @@
         <w:rPr>
           <w:rFonts w:ascii="Times New Roman" w:cs="Times New Roman" w:eastAsia="Times New Roman" w:hAnsi="Times New Roman"/>
           <w:b w:val="1"/>
+          <w:bCs w:val="1"/>
           <w:sz w:val="28"/>
           <w:szCs w:val="28"/>
           <w:u w:val="single"/>
@@ -5839,6 +5970,7 @@
         <w:rPr>
           <w:rFonts w:ascii="Times New Roman" w:cs="Times New Roman" w:eastAsia="Times New Roman" w:hAnsi="Times New Roman"/>
           <w:b w:val="1"/>
+          <w:bCs w:val="1"/>
           <w:sz w:val="28"/>
           <w:szCs w:val="28"/>
           <w:rtl w:val="0"/>
@@ -5852,7 +5984,7 @@
         <w:tabs>
           <w:tab w:val="left" w:leader="none" w:pos="3940"/>
         </w:tabs>
-        <w:spacing w:after="160" w:line="360" w:lineRule="auto"/>
+        <w:spacing w:after="0" w:line="360" w:lineRule="auto"/>
         <w:jc w:val="both"/>
         <w:rPr>
           <w:rFonts w:ascii="Courier New" w:cs="Courier New" w:eastAsia="Courier New" w:hAnsi="Courier New"/>
@@ -5878,11 +6010,12 @@
         <w:tabs>
           <w:tab w:val="left" w:leader="none" w:pos="3940"/>
         </w:tabs>
-        <w:spacing w:after="160" w:line="360" w:lineRule="auto"/>
+        <w:spacing w:after="0" w:line="360" w:lineRule="auto"/>
         <w:jc w:val="both"/>
         <w:rPr>
           <w:rFonts w:ascii="Courier New" w:cs="Courier New" w:eastAsia="Courier New" w:hAnsi="Courier New"/>
           <w:i w:val="1"/>
+          <w:iCs w:val="1"/>
           <w:color w:val="d7e4ff"/>
           <w:sz w:val="18"/>
           <w:szCs w:val="18"/>
@@ -5892,6 +6025,7 @@
         <w:rPr>
           <w:rFonts w:ascii="Courier New" w:cs="Courier New" w:eastAsia="Courier New" w:hAnsi="Courier New"/>
           <w:i w:val="1"/>
+          <w:iCs w:val="1"/>
           <w:color w:val="d7e4ff"/>
           <w:sz w:val="18"/>
           <w:szCs w:val="18"/>
@@ -5906,7 +6040,7 @@
         <w:tabs>
           <w:tab w:val="left" w:leader="none" w:pos="3940"/>
         </w:tabs>
-        <w:spacing w:after="160" w:line="360" w:lineRule="auto"/>
+        <w:spacing w:after="0" w:line="360" w:lineRule="auto"/>
         <w:jc w:val="both"/>
         <w:rPr>
           <w:rFonts w:ascii="Courier New" w:cs="Courier New" w:eastAsia="Courier New" w:hAnsi="Courier New"/>
@@ -6012,7 +6146,7 @@
         <w:tabs>
           <w:tab w:val="left" w:leader="none" w:pos="3940"/>
         </w:tabs>
-        <w:spacing w:after="160" w:line="360" w:lineRule="auto"/>
+        <w:spacing w:after="0" w:line="360" w:lineRule="auto"/>
         <w:jc w:val="both"/>
         <w:rPr>
           <w:rFonts w:ascii="Courier New" w:cs="Courier New" w:eastAsia="Courier New" w:hAnsi="Courier New"/>
@@ -6118,7 +6252,7 @@
         <w:tabs>
           <w:tab w:val="left" w:leader="none" w:pos="3940"/>
         </w:tabs>
-        <w:spacing w:after="160" w:line="360" w:lineRule="auto"/>
+        <w:spacing w:after="0" w:line="360" w:lineRule="auto"/>
         <w:jc w:val="both"/>
         <w:rPr>
           <w:rFonts w:ascii="Courier New" w:cs="Courier New" w:eastAsia="Courier New" w:hAnsi="Courier New"/>
@@ -6139,7 +6273,7 @@
         <w:tabs>
           <w:tab w:val="left" w:leader="none" w:pos="3940"/>
         </w:tabs>
-        <w:spacing w:after="160" w:line="360" w:lineRule="auto"/>
+        <w:spacing w:after="0" w:line="360" w:lineRule="auto"/>
         <w:jc w:val="both"/>
         <w:rPr>
           <w:rFonts w:ascii="Courier New" w:cs="Courier New" w:eastAsia="Courier New" w:hAnsi="Courier New"/>
@@ -6335,7 +6469,7 @@
         <w:tabs>
           <w:tab w:val="left" w:leader="none" w:pos="3940"/>
         </w:tabs>
-        <w:spacing w:after="160" w:line="360" w:lineRule="auto"/>
+        <w:spacing w:after="0" w:line="360" w:lineRule="auto"/>
         <w:jc w:val="both"/>
         <w:rPr>
           <w:rFonts w:ascii="Courier New" w:cs="Courier New" w:eastAsia="Courier New" w:hAnsi="Courier New"/>
@@ -6621,7 +6755,7 @@
         <w:tabs>
           <w:tab w:val="left" w:leader="none" w:pos="3940"/>
         </w:tabs>
-        <w:spacing w:after="160" w:line="360" w:lineRule="auto"/>
+        <w:spacing w:after="0" w:line="360" w:lineRule="auto"/>
         <w:jc w:val="both"/>
         <w:rPr>
           <w:rFonts w:ascii="Courier New" w:cs="Courier New" w:eastAsia="Courier New" w:hAnsi="Courier New"/>
@@ -6757,7 +6891,7 @@
         <w:tabs>
           <w:tab w:val="left" w:leader="none" w:pos="3940"/>
         </w:tabs>
-        <w:spacing w:after="160" w:line="360" w:lineRule="auto"/>
+        <w:spacing w:after="0" w:line="360" w:lineRule="auto"/>
         <w:jc w:val="both"/>
         <w:rPr>
           <w:rFonts w:ascii="Courier New" w:cs="Courier New" w:eastAsia="Courier New" w:hAnsi="Courier New"/>
@@ -6778,7 +6912,7 @@
         <w:tabs>
           <w:tab w:val="left" w:leader="none" w:pos="3940"/>
         </w:tabs>
-        <w:spacing w:after="160" w:line="360" w:lineRule="auto"/>
+        <w:spacing w:after="0" w:line="360" w:lineRule="auto"/>
         <w:jc w:val="both"/>
         <w:rPr>
           <w:rFonts w:ascii="Courier New" w:cs="Courier New" w:eastAsia="Courier New" w:hAnsi="Courier New"/>
@@ -6934,7 +7068,7 @@
         <w:tabs>
           <w:tab w:val="left" w:leader="none" w:pos="3940"/>
         </w:tabs>
-        <w:spacing w:after="160" w:line="360" w:lineRule="auto"/>
+        <w:spacing w:after="0" w:line="360" w:lineRule="auto"/>
         <w:jc w:val="both"/>
         <w:rPr>
           <w:rFonts w:ascii="Courier New" w:cs="Courier New" w:eastAsia="Courier New" w:hAnsi="Courier New"/>
@@ -7010,7 +7144,7 @@
         <w:tabs>
           <w:tab w:val="left" w:leader="none" w:pos="3940"/>
         </w:tabs>
-        <w:spacing w:after="160" w:line="360" w:lineRule="auto"/>
+        <w:spacing w:after="0" w:line="360" w:lineRule="auto"/>
         <w:jc w:val="both"/>
         <w:rPr>
           <w:rFonts w:ascii="Courier New" w:cs="Courier New" w:eastAsia="Courier New" w:hAnsi="Courier New"/>
@@ -7076,7 +7210,7 @@
         <w:tabs>
           <w:tab w:val="left" w:leader="none" w:pos="3940"/>
         </w:tabs>
-        <w:spacing w:after="160" w:line="360" w:lineRule="auto"/>
+        <w:spacing w:after="0" w:line="360" w:lineRule="auto"/>
         <w:jc w:val="both"/>
         <w:rPr>
           <w:rFonts w:ascii="Courier New" w:cs="Courier New" w:eastAsia="Courier New" w:hAnsi="Courier New"/>
@@ -7152,7 +7286,7 @@
         <w:tabs>
           <w:tab w:val="left" w:leader="none" w:pos="3940"/>
         </w:tabs>
-        <w:spacing w:after="160" w:line="360" w:lineRule="auto"/>
+        <w:spacing w:after="0" w:line="360" w:lineRule="auto"/>
         <w:jc w:val="both"/>
         <w:rPr>
           <w:rFonts w:ascii="Courier New" w:cs="Courier New" w:eastAsia="Courier New" w:hAnsi="Courier New"/>
@@ -7178,7 +7312,7 @@
         <w:tabs>
           <w:tab w:val="left" w:leader="none" w:pos="3940"/>
         </w:tabs>
-        <w:spacing w:after="160" w:line="360" w:lineRule="auto"/>
+        <w:spacing w:after="0" w:line="360" w:lineRule="auto"/>
         <w:jc w:val="both"/>
         <w:rPr>
           <w:rFonts w:ascii="Courier New" w:cs="Courier New" w:eastAsia="Courier New" w:hAnsi="Courier New"/>
@@ -7234,6 +7368,7 @@
         <w:rPr>
           <w:rFonts w:ascii="Times New Roman" w:cs="Times New Roman" w:eastAsia="Times New Roman" w:hAnsi="Times New Roman"/>
           <w:b w:val="1"/>
+          <w:bCs w:val="1"/>
           <w:sz w:val="24"/>
           <w:szCs w:val="24"/>
           <w:rtl w:val="0"/>
@@ -7346,6 +7481,7 @@
         <w:rPr>
           <w:rFonts w:ascii="Times New Roman" w:cs="Times New Roman" w:eastAsia="Times New Roman" w:hAnsi="Times New Roman"/>
           <w:b w:val="1"/>
+          <w:bCs w:val="1"/>
           <w:sz w:val="24"/>
           <w:szCs w:val="24"/>
         </w:rPr>
@@ -7354,6 +7490,7 @@
         <w:rPr>
           <w:rFonts w:ascii="Times New Roman" w:cs="Times New Roman" w:eastAsia="Times New Roman" w:hAnsi="Times New Roman"/>
           <w:b w:val="1"/>
+          <w:bCs w:val="1"/>
           <w:sz w:val="24"/>
           <w:szCs w:val="24"/>
           <w:rtl w:val="0"/>
@@ -7367,7 +7504,7 @@
         <w:tabs>
           <w:tab w:val="left" w:leader="none" w:pos="3940"/>
         </w:tabs>
-        <w:spacing w:after="160" w:line="360" w:lineRule="auto"/>
+        <w:spacing w:after="0" w:line="360" w:lineRule="auto"/>
         <w:jc w:val="both"/>
         <w:rPr>
           <w:rFonts w:ascii="Courier New" w:cs="Courier New" w:eastAsia="Courier New" w:hAnsi="Courier New"/>
@@ -7393,11 +7530,12 @@
         <w:tabs>
           <w:tab w:val="left" w:leader="none" w:pos="3940"/>
         </w:tabs>
-        <w:spacing w:after="160" w:line="360" w:lineRule="auto"/>
+        <w:spacing w:after="0" w:line="360" w:lineRule="auto"/>
         <w:jc w:val="both"/>
         <w:rPr>
           <w:rFonts w:ascii="Courier New" w:cs="Courier New" w:eastAsia="Courier New" w:hAnsi="Courier New"/>
           <w:i w:val="1"/>
+          <w:iCs w:val="1"/>
           <w:color w:val="d7e4ff"/>
           <w:sz w:val="18"/>
           <w:szCs w:val="18"/>
@@ -7407,6 +7545,7 @@
         <w:rPr>
           <w:rFonts w:ascii="Courier New" w:cs="Courier New" w:eastAsia="Courier New" w:hAnsi="Courier New"/>
           <w:i w:val="1"/>
+          <w:iCs w:val="1"/>
           <w:color w:val="d7e4ff"/>
           <w:sz w:val="18"/>
           <w:szCs w:val="18"/>
@@ -7421,7 +7560,7 @@
         <w:tabs>
           <w:tab w:val="left" w:leader="none" w:pos="3940"/>
         </w:tabs>
-        <w:spacing w:after="160" w:line="360" w:lineRule="auto"/>
+        <w:spacing w:after="0" w:line="360" w:lineRule="auto"/>
         <w:jc w:val="both"/>
         <w:rPr>
           <w:rFonts w:ascii="Courier New" w:cs="Courier New" w:eastAsia="Courier New" w:hAnsi="Courier New"/>
@@ -7527,7 +7666,7 @@
         <w:tabs>
           <w:tab w:val="left" w:leader="none" w:pos="3940"/>
         </w:tabs>
-        <w:spacing w:after="160" w:line="360" w:lineRule="auto"/>
+        <w:spacing w:after="0" w:line="360" w:lineRule="auto"/>
         <w:jc w:val="both"/>
         <w:rPr>
           <w:rFonts w:ascii="Courier New" w:cs="Courier New" w:eastAsia="Courier New" w:hAnsi="Courier New"/>
@@ -7638,7 +7777,7 @@
         <w:tabs>
           <w:tab w:val="left" w:leader="none" w:pos="3940"/>
         </w:tabs>
-        <w:spacing w:after="160" w:line="360" w:lineRule="auto"/>
+        <w:spacing w:after="0" w:line="360" w:lineRule="auto"/>
         <w:jc w:val="both"/>
         <w:rPr>
           <w:rFonts w:ascii="Courier New" w:cs="Courier New" w:eastAsia="Courier New" w:hAnsi="Courier New"/>
@@ -7834,7 +7973,7 @@
         <w:tabs>
           <w:tab w:val="left" w:leader="none" w:pos="3940"/>
         </w:tabs>
-        <w:spacing w:after="160" w:line="360" w:lineRule="auto"/>
+        <w:spacing w:after="0" w:line="360" w:lineRule="auto"/>
         <w:jc w:val="both"/>
         <w:rPr>
           <w:rFonts w:ascii="Courier New" w:cs="Courier New" w:eastAsia="Courier New" w:hAnsi="Courier New"/>
@@ -8110,7 +8249,7 @@
         <w:tabs>
           <w:tab w:val="left" w:leader="none" w:pos="3940"/>
         </w:tabs>
-        <w:spacing w:after="160" w:line="360" w:lineRule="auto"/>
+        <w:spacing w:after="0" w:line="360" w:lineRule="auto"/>
         <w:jc w:val="both"/>
         <w:rPr>
           <w:rFonts w:ascii="Courier New" w:cs="Courier New" w:eastAsia="Courier New" w:hAnsi="Courier New"/>
@@ -8276,7 +8415,7 @@
         <w:tabs>
           <w:tab w:val="left" w:leader="none" w:pos="3940"/>
         </w:tabs>
-        <w:spacing w:after="160" w:line="360" w:lineRule="auto"/>
+        <w:spacing w:after="0" w:line="360" w:lineRule="auto"/>
         <w:jc w:val="both"/>
         <w:rPr>
           <w:rFonts w:ascii="Courier New" w:cs="Courier New" w:eastAsia="Courier New" w:hAnsi="Courier New"/>
@@ -8342,7 +8481,7 @@
         <w:tabs>
           <w:tab w:val="left" w:leader="none" w:pos="3940"/>
         </w:tabs>
-        <w:spacing w:after="160" w:line="360" w:lineRule="auto"/>
+        <w:spacing w:after="0" w:line="360" w:lineRule="auto"/>
         <w:jc w:val="both"/>
         <w:rPr>
           <w:rFonts w:ascii="Courier New" w:cs="Courier New" w:eastAsia="Courier New" w:hAnsi="Courier New"/>
@@ -8453,7 +8592,7 @@
         <w:tabs>
           <w:tab w:val="left" w:leader="none" w:pos="3940"/>
         </w:tabs>
-        <w:spacing w:after="160" w:line="360" w:lineRule="auto"/>
+        <w:spacing w:after="0" w:line="360" w:lineRule="auto"/>
         <w:jc w:val="both"/>
         <w:rPr>
           <w:rFonts w:ascii="Courier New" w:cs="Courier New" w:eastAsia="Courier New" w:hAnsi="Courier New"/>
@@ -8589,7 +8728,7 @@
         <w:tabs>
           <w:tab w:val="left" w:leader="none" w:pos="3940"/>
         </w:tabs>
-        <w:spacing w:after="160" w:line="360" w:lineRule="auto"/>
+        <w:spacing w:after="0" w:line="360" w:lineRule="auto"/>
         <w:jc w:val="both"/>
         <w:rPr>
           <w:rFonts w:ascii="Courier New" w:cs="Courier New" w:eastAsia="Courier New" w:hAnsi="Courier New"/>
@@ -8665,7 +8804,7 @@
         <w:tabs>
           <w:tab w:val="left" w:leader="none" w:pos="3940"/>
         </w:tabs>
-        <w:spacing w:after="160" w:line="360" w:lineRule="auto"/>
+        <w:spacing w:after="0" w:line="360" w:lineRule="auto"/>
         <w:jc w:val="both"/>
         <w:rPr>
           <w:rFonts w:ascii="Courier New" w:cs="Courier New" w:eastAsia="Courier New" w:hAnsi="Courier New"/>
@@ -8731,7 +8870,7 @@
         <w:tabs>
           <w:tab w:val="left" w:leader="none" w:pos="3940"/>
         </w:tabs>
-        <w:spacing w:after="160" w:line="360" w:lineRule="auto"/>
+        <w:spacing w:after="0" w:line="360" w:lineRule="auto"/>
         <w:jc w:val="both"/>
         <w:rPr>
           <w:rFonts w:ascii="Courier New" w:cs="Courier New" w:eastAsia="Courier New" w:hAnsi="Courier New"/>
@@ -8807,7 +8946,7 @@
         <w:tabs>
           <w:tab w:val="left" w:leader="none" w:pos="3940"/>
         </w:tabs>
-        <w:spacing w:after="160" w:line="360" w:lineRule="auto"/>
+        <w:spacing w:after="0" w:line="360" w:lineRule="auto"/>
         <w:jc w:val="both"/>
         <w:rPr>
           <w:rFonts w:ascii="Courier New" w:cs="Courier New" w:eastAsia="Courier New" w:hAnsi="Courier New"/>
@@ -8833,11 +8972,12 @@
         <w:tabs>
           <w:tab w:val="left" w:leader="none" w:pos="3940"/>
         </w:tabs>
-        <w:spacing w:after="160" w:line="360" w:lineRule="auto"/>
+        <w:spacing w:after="0" w:line="360" w:lineRule="auto"/>
         <w:jc w:val="both"/>
         <w:rPr>
           <w:rFonts w:ascii="Times New Roman" w:cs="Times New Roman" w:eastAsia="Times New Roman" w:hAnsi="Times New Roman"/>
           <w:b w:val="1"/>
+          <w:bCs w:val="1"/>
           <w:sz w:val="28"/>
           <w:szCs w:val="28"/>
         </w:rPr>
@@ -8868,6 +9008,7 @@
         <w:rPr>
           <w:rFonts w:ascii="Times New Roman" w:cs="Times New Roman" w:eastAsia="Times New Roman" w:hAnsi="Times New Roman"/>
           <w:b w:val="1"/>
+          <w:bCs w:val="1"/>
           <w:sz w:val="24"/>
           <w:szCs w:val="24"/>
         </w:rPr>
@@ -8888,6 +9029,7 @@
         <w:rPr>
           <w:rFonts w:ascii="Times New Roman" w:cs="Times New Roman" w:eastAsia="Times New Roman" w:hAnsi="Times New Roman"/>
           <w:b w:val="1"/>
+          <w:bCs w:val="1"/>
           <w:sz w:val="28"/>
           <w:szCs w:val="28"/>
           <w:u w:val="single"/>
@@ -8897,6 +9039,7 @@
         <w:rPr>
           <w:rFonts w:ascii="Times New Roman" w:cs="Times New Roman" w:eastAsia="Times New Roman" w:hAnsi="Times New Roman"/>
           <w:b w:val="1"/>
+          <w:bCs w:val="1"/>
           <w:sz w:val="28"/>
           <w:szCs w:val="28"/>
           <w:u w:val="single"/>
@@ -8908,6 +9051,7 @@
         <w:rPr>
           <w:rFonts w:ascii="Times New Roman" w:cs="Times New Roman" w:eastAsia="Times New Roman" w:hAnsi="Times New Roman"/>
           <w:b w:val="1"/>
+          <w:bCs w:val="1"/>
           <w:sz w:val="28"/>
           <w:szCs w:val="28"/>
           <w:rtl w:val="0"/>
@@ -8926,11 +9070,12 @@
         <w:tabs>
           <w:tab w:val="left" w:leader="none" w:pos="3940"/>
         </w:tabs>
-        <w:spacing w:after="60" w:line="360" w:lineRule="auto"/>
+        <w:spacing w:after="0" w:line="360" w:lineRule="auto"/>
         <w:jc w:val="both"/>
         <w:rPr>
           <w:rFonts w:ascii="Courier New" w:cs="Courier New" w:eastAsia="Courier New" w:hAnsi="Courier New"/>
           <w:i w:val="1"/>
+          <w:iCs w:val="1"/>
           <w:color w:val="d7e4ff"/>
           <w:sz w:val="18"/>
           <w:szCs w:val="18"/>
@@ -8940,6 +9085,7 @@
         <w:rPr>
           <w:rFonts w:ascii="Courier New" w:cs="Courier New" w:eastAsia="Courier New" w:hAnsi="Courier New"/>
           <w:i w:val="1"/>
+          <w:iCs w:val="1"/>
           <w:color w:val="d7e4ff"/>
           <w:sz w:val="18"/>
           <w:szCs w:val="18"/>
@@ -8954,7 +9100,7 @@
         <w:tabs>
           <w:tab w:val="left" w:leader="none" w:pos="3940"/>
         </w:tabs>
-        <w:spacing w:after="60" w:line="360" w:lineRule="auto"/>
+        <w:spacing w:after="0" w:line="360" w:lineRule="auto"/>
         <w:jc w:val="both"/>
         <w:rPr>
           <w:rFonts w:ascii="Courier New" w:cs="Courier New" w:eastAsia="Courier New" w:hAnsi="Courier New"/>
@@ -9000,7 +9146,7 @@
         <w:tabs>
           <w:tab w:val="left" w:leader="none" w:pos="3940"/>
         </w:tabs>
-        <w:spacing w:after="60" w:line="360" w:lineRule="auto"/>
+        <w:spacing w:after="0" w:line="360" w:lineRule="auto"/>
         <w:jc w:val="both"/>
         <w:rPr>
           <w:rFonts w:ascii="Courier New" w:cs="Courier New" w:eastAsia="Courier New" w:hAnsi="Courier New"/>
@@ -9146,7 +9292,7 @@
         <w:tabs>
           <w:tab w:val="left" w:leader="none" w:pos="3940"/>
         </w:tabs>
-        <w:spacing w:after="60" w:line="360" w:lineRule="auto"/>
+        <w:spacing w:after="0" w:line="360" w:lineRule="auto"/>
         <w:jc w:val="both"/>
         <w:rPr>
           <w:rFonts w:ascii="Courier New" w:cs="Courier New" w:eastAsia="Courier New" w:hAnsi="Courier New"/>
@@ -9223,6 +9369,7 @@
         <w:rPr>
           <w:rFonts w:ascii="Times New Roman" w:cs="Times New Roman" w:eastAsia="Times New Roman" w:hAnsi="Times New Roman"/>
           <w:b w:val="1"/>
+          <w:bCs w:val="1"/>
           <w:sz w:val="24"/>
           <w:szCs w:val="24"/>
           <w:rtl w:val="0"/>
@@ -9275,6 +9422,7 @@
         <w:rPr>
           <w:rFonts w:ascii="Times New Roman" w:cs="Times New Roman" w:eastAsia="Times New Roman" w:hAnsi="Times New Roman"/>
           <w:b w:val="1"/>
+          <w:bCs w:val="1"/>
           <w:sz w:val="24"/>
           <w:szCs w:val="24"/>
           <w:rtl w:val="0"/>
@@ -9316,11 +9464,12 @@
         <w:tabs>
           <w:tab w:val="left" w:leader="none" w:pos="3940"/>
         </w:tabs>
-        <w:spacing w:after="60" w:line="360" w:lineRule="auto"/>
+        <w:spacing w:after="0" w:line="360" w:lineRule="auto"/>
         <w:jc w:val="both"/>
         <w:rPr>
           <w:rFonts w:ascii="Courier New" w:cs="Courier New" w:eastAsia="Courier New" w:hAnsi="Courier New"/>
           <w:i w:val="1"/>
+          <w:iCs w:val="1"/>
           <w:color w:val="d7e4ff"/>
           <w:sz w:val="18"/>
           <w:szCs w:val="18"/>
@@ -9330,6 +9479,7 @@
         <w:rPr>
           <w:rFonts w:ascii="Courier New" w:cs="Courier New" w:eastAsia="Courier New" w:hAnsi="Courier New"/>
           <w:i w:val="1"/>
+          <w:iCs w:val="1"/>
           <w:color w:val="d7e4ff"/>
           <w:sz w:val="18"/>
           <w:szCs w:val="18"/>
@@ -9344,7 +9494,7 @@
         <w:tabs>
           <w:tab w:val="left" w:leader="none" w:pos="3940"/>
         </w:tabs>
-        <w:spacing w:after="60" w:line="360" w:lineRule="auto"/>
+        <w:spacing w:after="0" w:line="360" w:lineRule="auto"/>
         <w:jc w:val="both"/>
         <w:rPr>
           <w:rFonts w:ascii="Courier New" w:cs="Courier New" w:eastAsia="Courier New" w:hAnsi="Courier New"/>
@@ -9390,7 +9540,7 @@
         <w:tabs>
           <w:tab w:val="left" w:leader="none" w:pos="3940"/>
         </w:tabs>
-        <w:spacing w:after="60" w:line="360" w:lineRule="auto"/>
+        <w:spacing w:after="0" w:line="360" w:lineRule="auto"/>
         <w:jc w:val="both"/>
         <w:rPr>
           <w:rFonts w:ascii="Courier New" w:cs="Courier New" w:eastAsia="Courier New" w:hAnsi="Courier New"/>
@@ -9536,7 +9686,7 @@
         <w:tabs>
           <w:tab w:val="left" w:leader="none" w:pos="3940"/>
         </w:tabs>
-        <w:spacing w:after="60" w:line="360" w:lineRule="auto"/>
+        <w:spacing w:after="0" w:line="360" w:lineRule="auto"/>
         <w:jc w:val="both"/>
         <w:rPr>
           <w:rFonts w:ascii="Courier New" w:cs="Courier New" w:eastAsia="Courier New" w:hAnsi="Courier New"/>
@@ -9605,6 +9755,7 @@
         <w:rPr>
           <w:rFonts w:ascii="Times New Roman" w:cs="Times New Roman" w:eastAsia="Times New Roman" w:hAnsi="Times New Roman"/>
           <w:b w:val="1"/>
+          <w:bCs w:val="1"/>
           <w:sz w:val="28"/>
           <w:szCs w:val="28"/>
         </w:rPr>
@@ -9613,6 +9764,7 @@
         <w:rPr>
           <w:rFonts w:ascii="Times New Roman" w:cs="Times New Roman" w:eastAsia="Times New Roman" w:hAnsi="Times New Roman"/>
           <w:b w:val="1"/>
+          <w:bCs w:val="1"/>
           <w:sz w:val="28"/>
           <w:szCs w:val="28"/>
           <w:u w:val="single"/>
@@ -9624,6 +9776,7 @@
         <w:rPr>
           <w:rFonts w:ascii="Times New Roman" w:cs="Times New Roman" w:eastAsia="Times New Roman" w:hAnsi="Times New Roman"/>
           <w:b w:val="1"/>
+          <w:bCs w:val="1"/>
           <w:sz w:val="28"/>
           <w:szCs w:val="28"/>
           <w:rtl w:val="0"/>
@@ -9637,7 +9790,7 @@
         <w:tabs>
           <w:tab w:val="left" w:leader="none" w:pos="3940"/>
         </w:tabs>
-        <w:spacing w:after="60" w:line="360" w:lineRule="auto"/>
+        <w:spacing w:after="0" w:line="360" w:lineRule="auto"/>
         <w:jc w:val="both"/>
         <w:rPr>
           <w:rFonts w:ascii="Courier New" w:cs="Courier New" w:eastAsia="Courier New" w:hAnsi="Courier New"/>
@@ -9713,7 +9866,7 @@
         <w:tabs>
           <w:tab w:val="left" w:leader="none" w:pos="3940"/>
         </w:tabs>
-        <w:spacing w:after="60" w:line="360" w:lineRule="auto"/>
+        <w:spacing w:after="0" w:line="360" w:lineRule="auto"/>
         <w:jc w:val="both"/>
         <w:rPr>
           <w:rFonts w:ascii="Courier New" w:cs="Courier New" w:eastAsia="Courier New" w:hAnsi="Courier New"/>
@@ -9769,7 +9922,7 @@
         <w:tabs>
           <w:tab w:val="left" w:leader="none" w:pos="3940"/>
         </w:tabs>
-        <w:spacing w:after="60" w:line="360" w:lineRule="auto"/>
+        <w:spacing w:after="0" w:line="360" w:lineRule="auto"/>
         <w:jc w:val="both"/>
         <w:rPr>
           <w:rFonts w:ascii="Courier New" w:cs="Courier New" w:eastAsia="Courier New" w:hAnsi="Courier New"/>
@@ -9795,7 +9948,7 @@
         <w:tabs>
           <w:tab w:val="left" w:leader="none" w:pos="3940"/>
         </w:tabs>
-        <w:spacing w:after="60" w:line="360" w:lineRule="auto"/>
+        <w:spacing w:after="0" w:line="360" w:lineRule="auto"/>
         <w:jc w:val="both"/>
         <w:rPr>
           <w:rFonts w:ascii="Courier New" w:cs="Courier New" w:eastAsia="Courier New" w:hAnsi="Courier New"/>
@@ -9871,11 +10024,12 @@
         <w:tabs>
           <w:tab w:val="left" w:leader="none" w:pos="3940"/>
         </w:tabs>
-        <w:spacing w:after="60" w:line="360" w:lineRule="auto"/>
+        <w:spacing w:after="0" w:line="360" w:lineRule="auto"/>
         <w:jc w:val="both"/>
         <w:rPr>
           <w:rFonts w:ascii="Courier New" w:cs="Courier New" w:eastAsia="Courier New" w:hAnsi="Courier New"/>
           <w:i w:val="1"/>
+          <w:iCs w:val="1"/>
           <w:color w:val="d7e4ff"/>
           <w:sz w:val="18"/>
           <w:szCs w:val="18"/>
@@ -9935,6 +10089,7 @@
         <w:rPr>
           <w:rFonts w:ascii="Courier New" w:cs="Courier New" w:eastAsia="Courier New" w:hAnsi="Courier New"/>
           <w:i w:val="1"/>
+          <w:iCs w:val="1"/>
           <w:color w:val="d7e4ff"/>
           <w:sz w:val="18"/>
           <w:szCs w:val="18"/>
@@ -9949,7 +10104,7 @@
         <w:tabs>
           <w:tab w:val="left" w:leader="none" w:pos="3940"/>
         </w:tabs>
-        <w:spacing w:after="60" w:line="360" w:lineRule="auto"/>
+        <w:spacing w:after="0" w:line="360" w:lineRule="auto"/>
         <w:jc w:val="both"/>
         <w:rPr>
           <w:rFonts w:ascii="Courier New" w:cs="Courier New" w:eastAsia="Courier New" w:hAnsi="Courier New"/>
@@ -10055,7 +10210,7 @@
         <w:tabs>
           <w:tab w:val="left" w:leader="none" w:pos="3940"/>
         </w:tabs>
-        <w:spacing w:after="60" w:line="360" w:lineRule="auto"/>
+        <w:spacing w:after="0" w:line="360" w:lineRule="auto"/>
         <w:jc w:val="both"/>
         <w:rPr>
           <w:rFonts w:ascii="Courier New" w:cs="Courier New" w:eastAsia="Courier New" w:hAnsi="Courier New"/>
@@ -10121,7 +10276,7 @@
         <w:tabs>
           <w:tab w:val="left" w:leader="none" w:pos="3940"/>
         </w:tabs>
-        <w:spacing w:after="60" w:line="360" w:lineRule="auto"/>
+        <w:spacing w:after="0" w:line="360" w:lineRule="auto"/>
         <w:jc w:val="both"/>
         <w:rPr>
           <w:rFonts w:ascii="Courier New" w:cs="Courier New" w:eastAsia="Courier New" w:hAnsi="Courier New"/>
@@ -10155,6 +10310,7 @@
         <w:rPr>
           <w:rFonts w:ascii="Times New Roman" w:cs="Times New Roman" w:eastAsia="Times New Roman" w:hAnsi="Times New Roman"/>
           <w:b w:val="1"/>
+          <w:bCs w:val="1"/>
           <w:sz w:val="28"/>
           <w:szCs w:val="28"/>
         </w:rPr>
@@ -10182,6 +10338,7 @@
         <w:rPr>
           <w:rFonts w:ascii="Times New Roman" w:cs="Times New Roman" w:eastAsia="Times New Roman" w:hAnsi="Times New Roman"/>
           <w:b w:val="1"/>
+          <w:bCs w:val="1"/>
           <w:sz w:val="24"/>
           <w:szCs w:val="24"/>
           <w:rtl w:val="0"/>
@@ -10208,6 +10365,7 @@
         <w:rPr>
           <w:rFonts w:ascii="Times New Roman" w:cs="Times New Roman" w:eastAsia="Times New Roman" w:hAnsi="Times New Roman"/>
           <w:b w:val="1"/>
+          <w:bCs w:val="1"/>
           <w:sz w:val="24"/>
           <w:szCs w:val="24"/>
         </w:rPr>
@@ -10235,6 +10393,7 @@
         <w:rPr>
           <w:rFonts w:ascii="Times New Roman" w:cs="Times New Roman" w:eastAsia="Times New Roman" w:hAnsi="Times New Roman"/>
           <w:b w:val="1"/>
+          <w:bCs w:val="1"/>
           <w:sz w:val="24"/>
           <w:szCs w:val="24"/>
           <w:rtl w:val="0"/>
@@ -10267,7 +10426,7 @@
         <w:tabs>
           <w:tab w:val="left" w:leader="none" w:pos="3940"/>
         </w:tabs>
-        <w:spacing w:after="60" w:line="360" w:lineRule="auto"/>
+        <w:spacing w:after="0" w:line="360" w:lineRule="auto"/>
         <w:jc w:val="both"/>
         <w:rPr>
           <w:rFonts w:ascii="Courier New" w:cs="Courier New" w:eastAsia="Courier New" w:hAnsi="Courier New"/>
@@ -10343,7 +10502,7 @@
         <w:tabs>
           <w:tab w:val="left" w:leader="none" w:pos="3940"/>
         </w:tabs>
-        <w:spacing w:after="60" w:line="360" w:lineRule="auto"/>
+        <w:spacing w:after="0" w:line="360" w:lineRule="auto"/>
         <w:jc w:val="both"/>
         <w:rPr>
           <w:rFonts w:ascii="Courier New" w:cs="Courier New" w:eastAsia="Courier New" w:hAnsi="Courier New"/>
@@ -10399,7 +10558,7 @@
         <w:tabs>
           <w:tab w:val="left" w:leader="none" w:pos="3940"/>
         </w:tabs>
-        <w:spacing w:after="60" w:line="360" w:lineRule="auto"/>
+        <w:spacing w:after="0" w:line="360" w:lineRule="auto"/>
         <w:jc w:val="both"/>
         <w:rPr>
           <w:rFonts w:ascii="Courier New" w:cs="Courier New" w:eastAsia="Courier New" w:hAnsi="Courier New"/>
@@ -10425,7 +10584,7 @@
         <w:tabs>
           <w:tab w:val="left" w:leader="none" w:pos="3940"/>
         </w:tabs>
-        <w:spacing w:after="60" w:line="360" w:lineRule="auto"/>
+        <w:spacing w:after="0" w:line="360" w:lineRule="auto"/>
         <w:jc w:val="both"/>
         <w:rPr>
           <w:rFonts w:ascii="Courier New" w:cs="Courier New" w:eastAsia="Courier New" w:hAnsi="Courier New"/>
@@ -10501,11 +10660,12 @@
         <w:tabs>
           <w:tab w:val="left" w:leader="none" w:pos="3940"/>
         </w:tabs>
-        <w:spacing w:after="60" w:line="360" w:lineRule="auto"/>
+        <w:spacing w:after="0" w:line="360" w:lineRule="auto"/>
         <w:jc w:val="both"/>
         <w:rPr>
           <w:rFonts w:ascii="Courier New" w:cs="Courier New" w:eastAsia="Courier New" w:hAnsi="Courier New"/>
           <w:i w:val="1"/>
+          <w:iCs w:val="1"/>
           <w:color w:val="d7e4ff"/>
           <w:sz w:val="18"/>
           <w:szCs w:val="18"/>
@@ -10635,6 +10795,7 @@
         <w:rPr>
           <w:rFonts w:ascii="Courier New" w:cs="Courier New" w:eastAsia="Courier New" w:hAnsi="Courier New"/>
           <w:i w:val="1"/>
+          <w:iCs w:val="1"/>
           <w:color w:val="d7e4ff"/>
           <w:sz w:val="18"/>
           <w:szCs w:val="18"/>
@@ -10649,7 +10810,7 @@
         <w:tabs>
           <w:tab w:val="left" w:leader="none" w:pos="3940"/>
         </w:tabs>
-        <w:spacing w:after="60" w:line="360" w:lineRule="auto"/>
+        <w:spacing w:after="0" w:line="360" w:lineRule="auto"/>
         <w:jc w:val="both"/>
         <w:rPr>
           <w:rFonts w:ascii="Courier New" w:cs="Courier New" w:eastAsia="Courier New" w:hAnsi="Courier New"/>
@@ -10755,7 +10916,7 @@
         <w:tabs>
           <w:tab w:val="left" w:leader="none" w:pos="3940"/>
         </w:tabs>
-        <w:spacing w:after="60" w:line="360" w:lineRule="auto"/>
+        <w:spacing w:after="0" w:line="360" w:lineRule="auto"/>
         <w:jc w:val="both"/>
         <w:rPr>
           <w:rFonts w:ascii="Courier New" w:cs="Courier New" w:eastAsia="Courier New" w:hAnsi="Courier New"/>
@@ -10821,11 +10982,12 @@
         <w:tabs>
           <w:tab w:val="left" w:leader="none" w:pos="3940"/>
         </w:tabs>
-        <w:spacing w:after="60" w:line="360" w:lineRule="auto"/>
+        <w:spacing w:after="0" w:line="360" w:lineRule="auto"/>
         <w:jc w:val="both"/>
         <w:rPr>
           <w:rFonts w:ascii="Fira Code" w:cs="Fira Code" w:eastAsia="Fira Code" w:hAnsi="Fira Code"/>
           <w:b w:val="1"/>
+          <w:bCs w:val="1"/>
           <w:color w:val="5cecc6"/>
           <w:sz w:val="18"/>
           <w:szCs w:val="18"/>
@@ -10835,6 +10997,7 @@
         <w:rPr>
           <w:rFonts w:ascii="Fira Code" w:cs="Fira Code" w:eastAsia="Fira Code" w:hAnsi="Fira Code"/>
           <w:b w:val="1"/>
+          <w:bCs w:val="1"/>
           <w:color w:val="5cecc6"/>
           <w:sz w:val="18"/>
           <w:szCs w:val="18"/>
@@ -10853,6 +11016,7 @@
         <w:rPr>
           <w:rFonts w:ascii="Times New Roman" w:cs="Times New Roman" w:eastAsia="Times New Roman" w:hAnsi="Times New Roman"/>
           <w:b w:val="1"/>
+          <w:bCs w:val="1"/>
           <w:sz w:val="28"/>
           <w:szCs w:val="28"/>
         </w:rPr>
@@ -10873,6 +11037,7 @@
         <w:rPr>
           <w:rFonts w:ascii="Times New Roman" w:cs="Times New Roman" w:eastAsia="Times New Roman" w:hAnsi="Times New Roman"/>
           <w:b w:val="1"/>
+          <w:bCs w:val="1"/>
           <w:sz w:val="28"/>
           <w:szCs w:val="28"/>
         </w:rPr>
@@ -10881,6 +11046,7 @@
         <w:rPr>
           <w:rFonts w:ascii="Times New Roman" w:cs="Times New Roman" w:eastAsia="Times New Roman" w:hAnsi="Times New Roman"/>
           <w:b w:val="1"/>
+          <w:bCs w:val="1"/>
           <w:sz w:val="28"/>
           <w:szCs w:val="28"/>
           <w:u w:val="single"/>
@@ -10892,6 +11058,7 @@
         <w:rPr>
           <w:rFonts w:ascii="Times New Roman" w:cs="Times New Roman" w:eastAsia="Times New Roman" w:hAnsi="Times New Roman"/>
           <w:b w:val="1"/>
+          <w:bCs w:val="1"/>
           <w:sz w:val="28"/>
           <w:szCs w:val="28"/>
           <w:rtl w:val="0"/>
@@ -10905,11 +11072,12 @@
         <w:tabs>
           <w:tab w:val="left" w:leader="none" w:pos="3940"/>
         </w:tabs>
-        <w:spacing w:after="160" w:line="360" w:lineRule="auto"/>
+        <w:spacing w:after="0" w:line="360" w:lineRule="auto"/>
         <w:jc w:val="both"/>
         <w:rPr>
           <w:rFonts w:ascii="Courier New" w:cs="Courier New" w:eastAsia="Courier New" w:hAnsi="Courier New"/>
           <w:i w:val="1"/>
+          <w:iCs w:val="1"/>
           <w:color w:val="d7e4ff"/>
           <w:sz w:val="18"/>
           <w:szCs w:val="18"/>
@@ -10919,6 +11087,7 @@
         <w:rPr>
           <w:rFonts w:ascii="Courier New" w:cs="Courier New" w:eastAsia="Courier New" w:hAnsi="Courier New"/>
           <w:i w:val="1"/>
+          <w:iCs w:val="1"/>
           <w:color w:val="d7e4ff"/>
           <w:sz w:val="18"/>
           <w:szCs w:val="18"/>
@@ -10933,7 +11102,7 @@
         <w:tabs>
           <w:tab w:val="left" w:leader="none" w:pos="3940"/>
         </w:tabs>
-        <w:spacing w:after="160" w:line="360" w:lineRule="auto"/>
+        <w:spacing w:after="0" w:line="360" w:lineRule="auto"/>
         <w:jc w:val="both"/>
         <w:rPr>
           <w:rFonts w:ascii="Courier New" w:cs="Courier New" w:eastAsia="Courier New" w:hAnsi="Courier New"/>
@@ -11009,7 +11178,7 @@
         <w:tabs>
           <w:tab w:val="left" w:leader="none" w:pos="3940"/>
         </w:tabs>
-        <w:spacing w:after="160" w:line="360" w:lineRule="auto"/>
+        <w:spacing w:after="0" w:line="360" w:lineRule="auto"/>
         <w:jc w:val="both"/>
         <w:rPr>
           <w:rFonts w:ascii="Courier New" w:cs="Courier New" w:eastAsia="Courier New" w:hAnsi="Courier New"/>
@@ -11090,7 +11259,7 @@
         <w:tabs>
           <w:tab w:val="left" w:leader="none" w:pos="3940"/>
         </w:tabs>
-        <w:spacing w:after="160" w:line="360" w:lineRule="auto"/>
+        <w:spacing w:after="0" w:line="360" w:lineRule="auto"/>
         <w:jc w:val="both"/>
         <w:rPr>
           <w:rFonts w:ascii="Courier New" w:cs="Courier New" w:eastAsia="Courier New" w:hAnsi="Courier New"/>
@@ -11176,7 +11345,7 @@
         <w:tabs>
           <w:tab w:val="left" w:leader="none" w:pos="3940"/>
         </w:tabs>
-        <w:spacing w:after="160" w:line="360" w:lineRule="auto"/>
+        <w:spacing w:after="0" w:line="360" w:lineRule="auto"/>
         <w:jc w:val="both"/>
         <w:rPr>
           <w:rFonts w:ascii="Courier New" w:cs="Courier New" w:eastAsia="Courier New" w:hAnsi="Courier New"/>
@@ -11267,7 +11436,7 @@
         <w:tabs>
           <w:tab w:val="left" w:leader="none" w:pos="3940"/>
         </w:tabs>
-        <w:spacing w:after="160" w:line="360" w:lineRule="auto"/>
+        <w:spacing w:after="0" w:line="360" w:lineRule="auto"/>
         <w:jc w:val="both"/>
         <w:rPr>
           <w:rFonts w:ascii="Courier New" w:cs="Courier New" w:eastAsia="Courier New" w:hAnsi="Courier New"/>
@@ -11373,7 +11542,7 @@
         <w:tabs>
           <w:tab w:val="left" w:leader="none" w:pos="3940"/>
         </w:tabs>
-        <w:spacing w:after="160" w:line="360" w:lineRule="auto"/>
+        <w:spacing w:after="0" w:line="360" w:lineRule="auto"/>
         <w:jc w:val="both"/>
         <w:rPr>
           <w:rFonts w:ascii="Courier New" w:cs="Courier New" w:eastAsia="Courier New" w:hAnsi="Courier New"/>
@@ -11439,7 +11608,7 @@
         <w:tabs>
           <w:tab w:val="left" w:leader="none" w:pos="3940"/>
         </w:tabs>
-        <w:spacing w:after="160" w:line="360" w:lineRule="auto"/>
+        <w:spacing w:after="0" w:line="360" w:lineRule="auto"/>
         <w:jc w:val="both"/>
         <w:rPr>
           <w:rFonts w:ascii="Courier New" w:cs="Courier New" w:eastAsia="Courier New" w:hAnsi="Courier New"/>
@@ -11475,7 +11644,7 @@
         <w:tabs>
           <w:tab w:val="left" w:leader="none" w:pos="3940"/>
         </w:tabs>
-        <w:spacing w:after="160" w:line="360" w:lineRule="auto"/>
+        <w:spacing w:after="0" w:line="360" w:lineRule="auto"/>
         <w:jc w:val="both"/>
         <w:rPr>
           <w:rFonts w:ascii="Courier New" w:cs="Courier New" w:eastAsia="Courier New" w:hAnsi="Courier New"/>
@@ -11545,6 +11714,7 @@
         <w:rPr>
           <w:rFonts w:ascii="Times New Roman" w:cs="Times New Roman" w:eastAsia="Times New Roman" w:hAnsi="Times New Roman"/>
           <w:b w:val="1"/>
+          <w:bCs w:val="1"/>
           <w:sz w:val="24"/>
           <w:szCs w:val="24"/>
         </w:rPr>
@@ -11572,6 +11742,7 @@
         <w:rPr>
           <w:rFonts w:ascii="Times New Roman" w:cs="Times New Roman" w:eastAsia="Times New Roman" w:hAnsi="Times New Roman"/>
           <w:b w:val="1"/>
+          <w:bCs w:val="1"/>
           <w:sz w:val="24"/>
           <w:szCs w:val="24"/>
           <w:rtl w:val="0"/>
@@ -11605,6 +11776,7 @@
         <w:rPr>
           <w:rFonts w:ascii="Times New Roman" w:cs="Times New Roman" w:eastAsia="Times New Roman" w:hAnsi="Times New Roman"/>
           <w:b w:val="1"/>
+          <w:bCs w:val="1"/>
           <w:sz w:val="24"/>
           <w:szCs w:val="24"/>
           <w:rtl w:val="0"/>
@@ -11646,11 +11818,12 @@
         <w:tabs>
           <w:tab w:val="left" w:leader="none" w:pos="3940"/>
         </w:tabs>
-        <w:spacing w:after="160" w:line="360" w:lineRule="auto"/>
+        <w:spacing w:after="0" w:line="360" w:lineRule="auto"/>
         <w:jc w:val="both"/>
         <w:rPr>
           <w:rFonts w:ascii="Courier New" w:cs="Courier New" w:eastAsia="Courier New" w:hAnsi="Courier New"/>
           <w:i w:val="1"/>
+          <w:iCs w:val="1"/>
           <w:color w:val="d7e4ff"/>
           <w:sz w:val="18"/>
           <w:szCs w:val="18"/>
@@ -11660,6 +11833,7 @@
         <w:rPr>
           <w:rFonts w:ascii="Courier New" w:cs="Courier New" w:eastAsia="Courier New" w:hAnsi="Courier New"/>
           <w:i w:val="1"/>
+          <w:iCs w:val="1"/>
           <w:color w:val="d7e4ff"/>
           <w:sz w:val="18"/>
           <w:szCs w:val="18"/>
@@ -11674,7 +11848,7 @@
         <w:tabs>
           <w:tab w:val="left" w:leader="none" w:pos="3940"/>
         </w:tabs>
-        <w:spacing w:after="160" w:line="360" w:lineRule="auto"/>
+        <w:spacing w:after="0" w:line="360" w:lineRule="auto"/>
         <w:jc w:val="both"/>
         <w:rPr>
           <w:rFonts w:ascii="Courier New" w:cs="Courier New" w:eastAsia="Courier New" w:hAnsi="Courier New"/>
@@ -11720,7 +11894,7 @@
         <w:tabs>
           <w:tab w:val="left" w:leader="none" w:pos="3940"/>
         </w:tabs>
-        <w:spacing w:after="160" w:line="360" w:lineRule="auto"/>
+        <w:spacing w:after="0" w:line="360" w:lineRule="auto"/>
         <w:jc w:val="both"/>
         <w:rPr>
           <w:rFonts w:ascii="Times New Roman" w:cs="Times New Roman" w:eastAsia="Times New Roman" w:hAnsi="Times New Roman"/>
@@ -11770,11 +11944,12 @@
         <w:tabs>
           <w:tab w:val="left" w:leader="none" w:pos="3940"/>
         </w:tabs>
-        <w:spacing w:after="160" w:line="360" w:lineRule="auto"/>
+        <w:spacing w:after="0" w:line="360" w:lineRule="auto"/>
         <w:jc w:val="both"/>
         <w:rPr>
           <w:rFonts w:ascii="Courier New" w:cs="Courier New" w:eastAsia="Courier New" w:hAnsi="Courier New"/>
           <w:i w:val="1"/>
+          <w:iCs w:val="1"/>
           <w:color w:val="d7e4ff"/>
           <w:sz w:val="18"/>
           <w:szCs w:val="18"/>
@@ -11792,11 +11967,12 @@
         <w:tabs>
           <w:tab w:val="left" w:leader="none" w:pos="3940"/>
         </w:tabs>
-        <w:spacing w:after="160" w:line="360" w:lineRule="auto"/>
+        <w:spacing w:after="0" w:line="360" w:lineRule="auto"/>
         <w:jc w:val="both"/>
         <w:rPr>
           <w:rFonts w:ascii="Courier New" w:cs="Courier New" w:eastAsia="Courier New" w:hAnsi="Courier New"/>
           <w:i w:val="1"/>
+          <w:iCs w:val="1"/>
           <w:color w:val="d7e4ff"/>
           <w:sz w:val="18"/>
           <w:szCs w:val="18"/>
@@ -11806,6 +11982,7 @@
         <w:rPr>
           <w:rFonts w:ascii="Courier New" w:cs="Courier New" w:eastAsia="Courier New" w:hAnsi="Courier New"/>
           <w:i w:val="1"/>
+          <w:iCs w:val="1"/>
           <w:color w:val="d7e4ff"/>
           <w:sz w:val="18"/>
           <w:szCs w:val="18"/>
@@ -11820,7 +11997,7 @@
         <w:tabs>
           <w:tab w:val="left" w:leader="none" w:pos="3940"/>
         </w:tabs>
-        <w:spacing w:after="160" w:line="360" w:lineRule="auto"/>
+        <w:spacing w:after="0" w:line="360" w:lineRule="auto"/>
         <w:jc w:val="both"/>
         <w:rPr>
           <w:rFonts w:ascii="Courier New" w:cs="Courier New" w:eastAsia="Courier New" w:hAnsi="Courier New"/>
@@ -11856,7 +12033,7 @@
         <w:tabs>
           <w:tab w:val="left" w:leader="none" w:pos="3940"/>
         </w:tabs>
-        <w:spacing w:after="160" w:line="360" w:lineRule="auto"/>
+        <w:spacing w:after="0" w:line="360" w:lineRule="auto"/>
         <w:jc w:val="both"/>
         <w:rPr>
           <w:rFonts w:ascii="Courier New" w:cs="Courier New" w:eastAsia="Courier New" w:hAnsi="Courier New"/>
@@ -11912,7 +12089,7 @@
         <w:tabs>
           <w:tab w:val="left" w:leader="none" w:pos="3940"/>
         </w:tabs>
-        <w:spacing w:after="160" w:line="360" w:lineRule="auto"/>
+        <w:spacing w:after="0" w:line="360" w:lineRule="auto"/>
         <w:jc w:val="both"/>
         <w:rPr>
           <w:rFonts w:ascii="Courier New" w:cs="Courier New" w:eastAsia="Courier New" w:hAnsi="Courier New"/>
@@ -11953,7 +12130,7 @@
         <w:tabs>
           <w:tab w:val="left" w:leader="none" w:pos="3940"/>
         </w:tabs>
-        <w:spacing w:after="160" w:line="360" w:lineRule="auto"/>
+        <w:spacing w:after="0" w:line="360" w:lineRule="auto"/>
         <w:jc w:val="both"/>
         <w:rPr>
           <w:rFonts w:ascii="Courier New" w:cs="Courier New" w:eastAsia="Courier New" w:hAnsi="Courier New"/>
@@ -12049,7 +12226,7 @@
         <w:tabs>
           <w:tab w:val="left" w:leader="none" w:pos="3940"/>
         </w:tabs>
-        <w:spacing w:after="160" w:line="360" w:lineRule="auto"/>
+        <w:spacing w:after="0" w:line="360" w:lineRule="auto"/>
         <w:jc w:val="both"/>
         <w:rPr>
           <w:rFonts w:ascii="Courier New" w:cs="Courier New" w:eastAsia="Courier New" w:hAnsi="Courier New"/>
@@ -12150,7 +12327,7 @@
         <w:tabs>
           <w:tab w:val="left" w:leader="none" w:pos="3940"/>
         </w:tabs>
-        <w:spacing w:after="160" w:line="360" w:lineRule="auto"/>
+        <w:spacing w:after="0" w:line="360" w:lineRule="auto"/>
         <w:jc w:val="both"/>
         <w:rPr>
           <w:rFonts w:ascii="Courier New" w:cs="Courier New" w:eastAsia="Courier New" w:hAnsi="Courier New"/>
@@ -12236,7 +12413,7 @@
         <w:tabs>
           <w:tab w:val="left" w:leader="none" w:pos="3940"/>
         </w:tabs>
-        <w:spacing w:after="160" w:line="360" w:lineRule="auto"/>
+        <w:spacing w:after="0" w:line="360" w:lineRule="auto"/>
         <w:jc w:val="both"/>
         <w:rPr>
           <w:rFonts w:ascii="Courier New" w:cs="Courier New" w:eastAsia="Courier New" w:hAnsi="Courier New"/>
@@ -12327,7 +12504,7 @@
         <w:tabs>
           <w:tab w:val="left" w:leader="none" w:pos="3940"/>
         </w:tabs>
-        <w:spacing w:after="160" w:line="360" w:lineRule="auto"/>
+        <w:spacing w:after="0" w:line="360" w:lineRule="auto"/>
         <w:jc w:val="both"/>
         <w:rPr>
           <w:rFonts w:ascii="Courier New" w:cs="Courier New" w:eastAsia="Courier New" w:hAnsi="Courier New"/>
@@ -12348,7 +12525,7 @@
         <w:tabs>
           <w:tab w:val="left" w:leader="none" w:pos="3940"/>
         </w:tabs>
-        <w:spacing w:after="160" w:line="360" w:lineRule="auto"/>
+        <w:spacing w:after="0" w:line="360" w:lineRule="auto"/>
         <w:jc w:val="both"/>
         <w:rPr>
           <w:rFonts w:ascii="Courier New" w:cs="Courier New" w:eastAsia="Courier New" w:hAnsi="Courier New"/>
@@ -12454,7 +12631,7 @@
         <w:tabs>
           <w:tab w:val="left" w:leader="none" w:pos="3940"/>
         </w:tabs>
-        <w:spacing w:after="160" w:line="360" w:lineRule="auto"/>
+        <w:spacing w:after="0" w:line="360" w:lineRule="auto"/>
         <w:jc w:val="both"/>
         <w:rPr>
           <w:rFonts w:ascii="Courier New" w:cs="Courier New" w:eastAsia="Courier New" w:hAnsi="Courier New"/>
@@ -12520,7 +12697,7 @@
         <w:tabs>
           <w:tab w:val="left" w:leader="none" w:pos="3940"/>
         </w:tabs>
-        <w:spacing w:after="160" w:line="360" w:lineRule="auto"/>
+        <w:spacing w:after="0" w:line="360" w:lineRule="auto"/>
         <w:jc w:val="both"/>
         <w:rPr>
           <w:rFonts w:ascii="Courier New" w:cs="Courier New" w:eastAsia="Courier New" w:hAnsi="Courier New"/>
@@ -12556,7 +12733,7 @@
         <w:tabs>
           <w:tab w:val="left" w:leader="none" w:pos="3940"/>
         </w:tabs>
-        <w:spacing w:after="160" w:line="360" w:lineRule="auto"/>
+        <w:spacing w:after="0" w:line="360" w:lineRule="auto"/>
         <w:jc w:val="both"/>
         <w:rPr>
           <w:rFonts w:ascii="Courier New" w:cs="Courier New" w:eastAsia="Courier New" w:hAnsi="Courier New"/>
@@ -12630,6 +12807,7 @@
         <w:rPr>
           <w:rFonts w:ascii="Times New Roman" w:cs="Times New Roman" w:eastAsia="Times New Roman" w:hAnsi="Times New Roman"/>
           <w:b w:val="1"/>
+          <w:bCs w:val="1"/>
           <w:sz w:val="28"/>
           <w:szCs w:val="28"/>
         </w:rPr>
@@ -12649,6 +12827,7 @@
         <w:rPr>
           <w:rFonts w:ascii="Times New Roman" w:cs="Times New Roman" w:eastAsia="Times New Roman" w:hAnsi="Times New Roman"/>
           <w:b w:val="1"/>
+          <w:bCs w:val="1"/>
           <w:sz w:val="28"/>
           <w:szCs w:val="28"/>
         </w:rPr>
@@ -12668,6 +12847,7 @@
         <w:rPr>
           <w:rFonts w:ascii="Times New Roman" w:cs="Times New Roman" w:eastAsia="Times New Roman" w:hAnsi="Times New Roman"/>
           <w:b w:val="1"/>
+          <w:bCs w:val="1"/>
           <w:sz w:val="28"/>
           <w:szCs w:val="28"/>
         </w:rPr>
@@ -12699,12 +12879,56 @@
     </w:p>
     <w:sectPr>
       <w:headerReference r:id="rId6" w:type="default"/>
+      <w:footerReference r:id="rId7" w:type="default"/>
       <w:pgSz w:h="16838" w:w="11906" w:orient="portrait"/>
       <w:pgMar w:bottom="1440" w:top="1440" w:left="1440" w:right="1440" w:header="720" w:footer="720"/>
       <w:pgNumType w:start="1"/>
     </w:sectPr>
   </w:body>
 </w:document>
+</file>
+
+<file path=word/footer1.xml><?xml version="1.0" encoding="utf-8"?>
+<w:ftr xmlns:mc="http://schemas.openxmlformats.org/markup-compatibility/2006" xmlns:o="urn:schemas-microsoft-com:office:office" xmlns:r="http://schemas.openxmlformats.org/officeDocument/2006/relationships" xmlns:m="http://schemas.openxmlformats.org/officeDocument/2006/math" xmlns:v="urn:schemas-microsoft-com:vml" xmlns:wp="http://schemas.openxmlformats.org/drawingml/2006/wordprocessingDrawing" xmlns:w10="urn:schemas-microsoft-com:office:word" xmlns:w="http://schemas.openxmlformats.org/wordprocessingml/2006/main" xmlns:wne="http://schemas.microsoft.com/office/word/2006/wordml" xmlns:sl="http://schemas.openxmlformats.org/schemaLibrary/2006/main" xmlns:a="http://schemas.openxmlformats.org/drawingml/2006/main" xmlns:pic="http://schemas.openxmlformats.org/drawingml/2006/picture" xmlns:c="http://schemas.openxmlformats.org/drawingml/2006/chart" xmlns:lc="http://schemas.openxmlformats.org/drawingml/2006/lockedCanvas" xmlns:dgm="http://schemas.openxmlformats.org/drawingml/2006/diagram" xmlns:wps="http://schemas.microsoft.com/office/word/2010/wordprocessingShape" xmlns:wpg="http://schemas.microsoft.com/office/word/2010/wordprocessingGroup" xmlns:w14="http://schemas.microsoft.com/office/word/2010/wordml" xmlns:w15="http://schemas.microsoft.com/office/word/2012/wordml" xmlns:w16="http://schemas.microsoft.com/office/word/2018/wordml" xmlns:w16cex="http://schemas.microsoft.com/office/word/2018/wordml/cex" xmlns:w16cid="http://schemas.microsoft.com/office/word/2016/wordml/cid" xmlns="http://schemas.microsoft.com/office/tasks/2019/documenttasks" xmlns:cr="http://schemas.microsoft.com/office/comments/2020/reactions">
+  <w:p>
+    <w:pPr>
+      <w:rPr/>
+    </w:pPr>
+    <w:r>
+      <w:rPr>
+        <w:rFonts w:ascii="Times New Roman" w:cs="Times New Roman" w:eastAsia="Times New Roman" w:hAnsi="Times New Roman"/>
+        <w:rtl w:val="0"/>
+      </w:rPr>
+      <w:t xml:space="preserve">AMTICS_CSE</w:t>
+      <w:tab/>
+      <w:tab/>
+      <w:tab/>
+      <w:tab/>
+      <w:tab/>
+      <w:tab/>
+      <w:tab/>
+      <w:tab/>
+      <w:tab/>
+      <w:tab/>
+      <w:tab/>
+      <w:t xml:space="preserve">    </w:t>
+    </w:r>
+    <w:r>
+      <w:rPr>
+        <w:rFonts w:ascii="Times New Roman" w:cs="Times New Roman" w:eastAsia="Times New Roman" w:hAnsi="Times New Roman"/>
+      </w:rPr>
+      <w:fldChar w:fldCharType="begin"/>
+      <w:instrText xml:space="preserve">PAGE</w:instrText>
+      <w:fldChar w:fldCharType="separate"/>
+      <w:fldChar w:fldCharType="end"/>
+    </w:r>
+    <w:r>
+      <w:rPr>
+        <w:rtl w:val="0"/>
+      </w:rPr>
+    </w:r>
+  </w:p>
+</w:ftr>
 </file>
 
 <file path=word/header1.xml><?xml version="1.0" encoding="utf-8"?>
@@ -13224,11 +13448,19 @@
       </w:pPr>
     </w:pPrDefault>
   </w:docDefaults>
+  <w:style w:type="table" w:styleId="TableNormal" w:default="1">
+    <w:name w:val="TableNormal"/>
+    <w:tblPr>
+      <w:tblCellMar>
+        <w:top w:w="100.0" w:type="dxa"/>
+        <w:left w:w="100.0" w:type="dxa"/>
+        <w:bottom w:w="100.0" w:type="dxa"/>
+        <w:right w:w="100.0" w:type="dxa"/>
+      </w:tblCellMar>
+    </w:tblPr>
+  </w:style>
   <w:style w:type="paragraph" w:styleId="Normal" w:default="1">
     <w:name w:val="normal"/>
-  </w:style>
-  <w:style w:type="table" w:styleId="TableNormal" w:default="1">
-    <w:name w:val="TableNormal"/>
   </w:style>
   <w:style w:type="paragraph" w:styleId="Heading1">
     <w:name w:val="heading 1"/>
@@ -13257,6 +13489,7 @@
     </w:pPr>
     <w:rPr>
       <w:b w:val="0"/>
+      <w:bCs w:val="0"/>
       <w:sz w:val="32"/>
       <w:szCs w:val="32"/>
     </w:rPr>
@@ -13273,6 +13506,7 @@
     </w:pPr>
     <w:rPr>
       <w:b w:val="0"/>
+      <w:bCs w:val="0"/>
       <w:color w:val="434343"/>
       <w:sz w:val="28"/>
       <w:szCs w:val="28"/>
@@ -13322,6 +13556,7 @@
     </w:pPr>
     <w:rPr>
       <w:i w:val="1"/>
+      <w:iCs w:val="1"/>
       <w:color w:val="666666"/>
       <w:sz w:val="22"/>
       <w:szCs w:val="22"/>
@@ -13355,6 +13590,7 @@
     <w:rPr>
       <w:rFonts w:ascii="Arial" w:cs="Arial" w:eastAsia="Arial" w:hAnsi="Arial"/>
       <w:i w:val="0"/>
+      <w:iCs w:val="0"/>
       <w:color w:val="666666"/>
       <w:sz w:val="30"/>
       <w:szCs w:val="30"/>
@@ -13365,12 +13601,6 @@
     <w:tblPr>
       <w:tblStyleRowBandSize w:val="1"/>
       <w:tblStyleColBandSize w:val="1"/>
-      <w:tblCellMar>
-        <w:top w:w="100.0" w:type="dxa"/>
-        <w:left w:w="100.0" w:type="dxa"/>
-        <w:bottom w:w="100.0" w:type="dxa"/>
-        <w:right w:w="100.0" w:type="dxa"/>
-      </w:tblCellMar>
     </w:tblPr>
   </w:style>
   <w:style w:type="table" w:styleId="Table2">
@@ -13378,12 +13608,6 @@
     <w:tblPr>
       <w:tblStyleRowBandSize w:val="1"/>
       <w:tblStyleColBandSize w:val="1"/>
-      <w:tblCellMar>
-        <w:top w:w="100.0" w:type="dxa"/>
-        <w:left w:w="100.0" w:type="dxa"/>
-        <w:bottom w:w="100.0" w:type="dxa"/>
-        <w:right w:w="100.0" w:type="dxa"/>
-      </w:tblCellMar>
     </w:tblPr>
   </w:style>
   <w:style w:type="table" w:styleId="Table3">
@@ -13391,12 +13615,6 @@
     <w:tblPr>
       <w:tblStyleRowBandSize w:val="1"/>
       <w:tblStyleColBandSize w:val="1"/>
-      <w:tblCellMar>
-        <w:top w:w="100.0" w:type="dxa"/>
-        <w:left w:w="100.0" w:type="dxa"/>
-        <w:bottom w:w="100.0" w:type="dxa"/>
-        <w:right w:w="100.0" w:type="dxa"/>
-      </w:tblCellMar>
     </w:tblPr>
   </w:style>
 </w:styles>

</xml_diff>